<commit_message>
Codigo con correcciones para que pueda compilar
</commit_message>
<xml_diff>
--- a/S04_P1_El_build_sin_IDE/S04_P1_El_build_sin_IDE/S04_P1_Practica.docx
+++ b/S04_P1_El_build_sin_IDE/S04_P1_El_build_sin_IDE/S04_P1_Practica.docx
@@ -1,6 +1,6 @@
 
 <file path=word/document.xml><?xml version="1.0" encoding="utf-8"?>
-<w:document xmlns:wpc="http://schemas.microsoft.com/office/word/2010/wordprocessingCanvas" xmlns:cx="http://schemas.microsoft.com/office/drawing/2014/chartex" xmlns:cx1="http://schemas.microsoft.com/office/drawing/2015/9/8/chartex" xmlns:cx2="http://schemas.microsoft.com/office/drawing/2015/10/21/chartex" xmlns:cx3="http://schemas.microsoft.com/office/drawing/2016/5/9/chartex" xmlns:cx4="http://schemas.microsoft.com/office/drawing/2016/5/10/chartex" xmlns:cx5="http://schemas.microsoft.com/office/drawing/2016/5/11/chartex" xmlns:cx6="http://schemas.microsoft.com/office/drawing/2016/5/12/chartex" xmlns:cx7="http://schemas.microsoft.com/office/drawing/2016/5/13/chartex" xmlns:cx8="http://schemas.microsoft.com/office/drawing/2016/5/14/chartex" xmlns:mc="http://schemas.openxmlformats.org/markup-compatibility/2006" xmlns:aink="http://schemas.microsoft.com/office/drawing/2016/ink" xmlns:am3d="http://schemas.microsoft.com/office/drawing/2017/model3d" xmlns:o="urn:schemas-microsoft-com:office:office" xmlns:oel="http://schemas.microsoft.com/office/2019/extlst" xmlns:r="http://schemas.openxmlformats.org/officeDocument/2006/relationships" xmlns:m="http://schemas.openxmlformats.org/officeDocument/2006/math" xmlns:v="urn:schemas-microsoft-com:vml" xmlns:wp14="http://schemas.microsoft.com/office/word/2010/wordprocessingDrawing" xmlns:wp="http://schemas.openxmlformats.org/drawingml/2006/wordprocessingDrawing" xmlns:w10="urn:schemas-microsoft-com:office:word" xmlns:w="http://schemas.openxmlformats.org/wordprocessingml/2006/main" xmlns:w14="http://schemas.microsoft.com/office/word/2010/wordml" xmlns:w15="http://schemas.microsoft.com/office/word/2012/wordml" xmlns:w16cex="http://schemas.microsoft.com/office/word/2018/wordml/cex" xmlns:w16cid="http://schemas.microsoft.com/office/word/2016/wordml/cid" xmlns:w16="http://schemas.microsoft.com/office/word/2018/wordml" xmlns:w16du="http://schemas.microsoft.com/office/word/2023/wordml/word16du" xmlns:w16sdtdh="http://schemas.microsoft.com/office/word/2020/wordml/sdtdatahash" xmlns:w16sdtfl="http://schemas.microsoft.com/office/word/2024/wordml/sdtformatlock" xmlns:w16se="http://schemas.microsoft.com/office/word/2015/wordml/symex" xmlns:wpg="http://schemas.microsoft.com/office/word/2010/wordprocessingGroup" xmlns:wpi="http://schemas.microsoft.com/office/word/2010/wordprocessingInk" xmlns:wne="http://schemas.microsoft.com/office/word/2006/wordml" xmlns:wps="http://schemas.microsoft.com/office/word/2010/wordprocessingShape" mc:Ignorable="w14 w15 w16se w16cid w16 w16cex w16sdtdh w16sdtfl w16du wp14">
+<w:document xmlns:wpc="http://schemas.microsoft.com/office/word/2010/wordprocessingCanvas" xmlns:cx="http://schemas.microsoft.com/office/drawing/2014/chartex" xmlns:cx1="http://schemas.microsoft.com/office/drawing/2015/9/8/chartex" xmlns:cx2="http://schemas.microsoft.com/office/drawing/2015/10/21/chartex" xmlns:cx3="http://schemas.microsoft.com/office/drawing/2016/5/9/chartex" xmlns:cx4="http://schemas.microsoft.com/office/drawing/2016/5/10/chartex" xmlns:cx5="http://schemas.microsoft.com/office/drawing/2016/5/11/chartex" xmlns:cx6="http://schemas.microsoft.com/office/drawing/2016/5/12/chartex" xmlns:cx7="http://schemas.microsoft.com/office/drawing/2016/5/13/chartex" xmlns:cx8="http://schemas.microsoft.com/office/drawing/2016/5/14/chartex" xmlns:mc="http://schemas.openxmlformats.org/markup-compatibility/2006" xmlns:aink="http://schemas.microsoft.com/office/drawing/2016/ink" xmlns:am3d="http://schemas.microsoft.com/office/drawing/2017/model3d" xmlns:o="urn:schemas-microsoft-com:office:office" xmlns:oel="http://schemas.microsoft.com/office/2019/extlst" xmlns:r="http://schemas.openxmlformats.org/officeDocument/2006/relationships" xmlns:m="http://schemas.openxmlformats.org/officeDocument/2006/math" xmlns:v="urn:schemas-microsoft-com:vml" xmlns:wp14="http://schemas.microsoft.com/office/word/2010/wordprocessingDrawing" xmlns:wp="http://schemas.openxmlformats.org/drawingml/2006/wordprocessingDrawing" xmlns:w10="urn:schemas-microsoft-com:office:word" xmlns:w="http://schemas.openxmlformats.org/wordprocessingml/2006/main" xmlns:w14="http://schemas.microsoft.com/office/word/2010/wordml" xmlns:w15="http://schemas.microsoft.com/office/word/2012/wordml" xmlns:w16cex="http://schemas.microsoft.com/office/word/2018/wordml/cex" xmlns:w16cid="http://schemas.microsoft.com/office/word/2016/wordml/cid" xmlns:w16="http://schemas.microsoft.com/office/word/2018/wordml" xmlns:w16sdtdh="http://schemas.microsoft.com/office/word/2020/wordml/sdtdatahash" xmlns:w16se="http://schemas.microsoft.com/office/word/2015/wordml/symex" xmlns:wpg="http://schemas.microsoft.com/office/word/2010/wordprocessingGroup" xmlns:wpi="http://schemas.microsoft.com/office/word/2010/wordprocessingInk" xmlns:wne="http://schemas.microsoft.com/office/word/2006/wordml" xmlns:wps="http://schemas.microsoft.com/office/word/2010/wordprocessingShape" mc:Ignorable="w14 w15 w16se w16cid w16 w16cex w16sdtdh wp14">
   <w:body>
     <w:p>
       <w:pPr>
@@ -18,7 +18,31 @@
           <w:szCs w:val="30"/>
           <w:lang w:val="es-ES"/>
         </w:rPr>
-        <w:t>P1 · El build sin IDE</w:t>
+        <w:t xml:space="preserve">P1 · El </w:t>
+      </w:r>
+      <w:proofErr w:type="spellStart"/>
+      <w:r>
+        <w:rPr>
+          <w:b/>
+          <w:bCs/>
+          <w:color w:val="1F5C8B"/>
+          <w:sz w:val="30"/>
+          <w:szCs w:val="30"/>
+          <w:lang w:val="es-ES"/>
+        </w:rPr>
+        <w:t>build</w:t>
+      </w:r>
+      <w:proofErr w:type="spellEnd"/>
+      <w:r>
+        <w:rPr>
+          <w:b/>
+          <w:bCs/>
+          <w:color w:val="1F5C8B"/>
+          <w:sz w:val="30"/>
+          <w:szCs w:val="30"/>
+          <w:lang w:val="es-ES"/>
+        </w:rPr>
+        <w:t xml:space="preserve"> sin IDE</w:t>
       </w:r>
     </w:p>
     <w:p>
@@ -82,6 +106,7 @@
             </w:tcMar>
           </w:tcPr>
           <w:p>
+            <w:proofErr w:type="spellStart"/>
             <w:r>
               <w:rPr>
                 <w:color w:val="5A6472"/>
@@ -89,6 +114,15 @@
                 <w:szCs w:val="16"/>
               </w:rPr>
               <w:t>Nombre</w:t>
+            </w:r>
+            <w:proofErr w:type="spellEnd"/>
+            <w:r>
+              <w:rPr>
+                <w:color w:val="5A6472"/>
+                <w:sz w:val="16"/>
+                <w:szCs w:val="16"/>
+              </w:rPr>
+              <w:t>: Benjamin Soto Coronado</w:t>
             </w:r>
           </w:p>
         </w:tc>
@@ -109,6 +143,7 @@
             </w:tcMar>
           </w:tcPr>
           <w:p>
+            <w:proofErr w:type="spellStart"/>
             <w:r>
               <w:rPr>
                 <w:color w:val="5A6472"/>
@@ -116,6 +151,15 @@
                 <w:szCs w:val="16"/>
               </w:rPr>
               <w:t>Matrícula</w:t>
+            </w:r>
+            <w:proofErr w:type="spellEnd"/>
+            <w:r>
+              <w:rPr>
+                <w:color w:val="5A6472"/>
+                <w:sz w:val="16"/>
+                <w:szCs w:val="16"/>
+              </w:rPr>
+              <w:t>: 253183</w:t>
             </w:r>
           </w:p>
         </w:tc>
@@ -135,16 +179,7 @@
               <w:right w:w="100" w:type="dxa"/>
             </w:tcMar>
           </w:tcPr>
-          <w:p>
-            <w:r>
-              <w:rPr>
-                <w:color w:val="5A6472"/>
-                <w:sz w:val="16"/>
-                <w:szCs w:val="16"/>
-              </w:rPr>
-              <w:t>Grupo</w:t>
-            </w:r>
-          </w:p>
+          <w:p/>
         </w:tc>
         <w:tc>
           <w:tcPr>
@@ -162,16 +197,7 @@
               <w:right w:w="100" w:type="dxa"/>
             </w:tcMar>
           </w:tcPr>
-          <w:p>
-            <w:r>
-              <w:rPr>
-                <w:color w:val="5A6472"/>
-                <w:sz w:val="16"/>
-                <w:szCs w:val="16"/>
-              </w:rPr>
-              <w:t>Fecha</w:t>
-            </w:r>
-          </w:p>
+          <w:p/>
         </w:tc>
       </w:tr>
     </w:tbl>
@@ -179,6 +205,7 @@
       <w:pPr>
         <w:spacing w:before="220" w:after="90"/>
       </w:pPr>
+      <w:proofErr w:type="spellStart"/>
       <w:r>
         <w:rPr>
           <w:b/>
@@ -187,8 +214,31 @@
           <w:sz w:val="23"/>
           <w:szCs w:val="23"/>
         </w:rPr>
-        <w:t>Qué entregas</w:t>
-      </w:r>
+        <w:t>Qué</w:t>
+      </w:r>
+      <w:proofErr w:type="spellEnd"/>
+      <w:r>
+        <w:rPr>
+          <w:b/>
+          <w:bCs/>
+          <w:color w:val="1F5C8B"/>
+          <w:sz w:val="23"/>
+          <w:szCs w:val="23"/>
+        </w:rPr>
+        <w:t xml:space="preserve"> </w:t>
+      </w:r>
+      <w:proofErr w:type="spellStart"/>
+      <w:r>
+        <w:rPr>
+          <w:b/>
+          <w:bCs/>
+          <w:color w:val="1F5C8B"/>
+          <w:sz w:val="23"/>
+          <w:szCs w:val="23"/>
+        </w:rPr>
+        <w:t>entregas</w:t>
+      </w:r>
+      <w:proofErr w:type="spellEnd"/>
     </w:p>
     <w:p>
       <w:pPr>
@@ -212,7 +262,23 @@
           <w:color w:val="1A1A1A"/>
           <w:lang w:val="es-ES"/>
         </w:rPr>
-        <w:t>El link de tu repositorio Git con el proyecto y dos commits: antes y después de la corrección.</w:t>
+        <w:t xml:space="preserve">El link de tu repositorio Git con el proyecto y dos </w:t>
+      </w:r>
+      <w:proofErr w:type="spellStart"/>
+      <w:r>
+        <w:rPr>
+          <w:color w:val="1A1A1A"/>
+          <w:lang w:val="es-ES"/>
+        </w:rPr>
+        <w:t>commits</w:t>
+      </w:r>
+      <w:proofErr w:type="spellEnd"/>
+      <w:r>
+        <w:rPr>
+          <w:color w:val="1A1A1A"/>
+          <w:lang w:val="es-ES"/>
+        </w:rPr>
+        <w:t>: antes y después de la corrección.</w:t>
       </w:r>
     </w:p>
     <w:p>
@@ -290,13 +356,62 @@
           <w:color w:val="1A1A1A"/>
           <w:lang w:val="es-ES"/>
         </w:rPr>
-        <w:t>Descomprime el ZIP, crea un repositorio Git con la carpeta descuento-volumen y haz el primer commit. Abre la terminal EN la carpeta que contiene pom.xml. Necesitas JDK 21 (java -version) y Maven 3.9+ (mvn -v). Este mismo repositorio se usa en la P2: no lo borres.</w:t>
+        <w:t xml:space="preserve">Descomprime el ZIP, crea un repositorio Git con la carpeta descuento-volumen y haz el primer </w:t>
+      </w:r>
+      <w:proofErr w:type="spellStart"/>
+      <w:r>
+        <w:rPr>
+          <w:color w:val="1A1A1A"/>
+          <w:lang w:val="es-ES"/>
+        </w:rPr>
+        <w:t>commit</w:t>
+      </w:r>
+      <w:proofErr w:type="spellEnd"/>
+      <w:r>
+        <w:rPr>
+          <w:color w:val="1A1A1A"/>
+          <w:lang w:val="es-ES"/>
+        </w:rPr>
+        <w:t>. Abre la terminal EN la carpeta que contiene pom.xml. Necesitas JDK 21 (java -</w:t>
+      </w:r>
+      <w:proofErr w:type="spellStart"/>
+      <w:r>
+        <w:rPr>
+          <w:color w:val="1A1A1A"/>
+          <w:lang w:val="es-ES"/>
+        </w:rPr>
+        <w:t>version</w:t>
+      </w:r>
+      <w:proofErr w:type="spellEnd"/>
+      <w:r>
+        <w:rPr>
+          <w:color w:val="1A1A1A"/>
+          <w:lang w:val="es-ES"/>
+        </w:rPr>
+        <w:t>) y Maven 3.9+ (</w:t>
+      </w:r>
+      <w:proofErr w:type="spellStart"/>
+      <w:r>
+        <w:rPr>
+          <w:color w:val="1A1A1A"/>
+          <w:lang w:val="es-ES"/>
+        </w:rPr>
+        <w:t>mvn</w:t>
+      </w:r>
+      <w:proofErr w:type="spellEnd"/>
+      <w:r>
+        <w:rPr>
+          <w:color w:val="1A1A1A"/>
+          <w:lang w:val="es-ES"/>
+        </w:rPr>
+        <w:t xml:space="preserve"> -v). Este mismo repositorio se usa en la P2: no lo borres.</w:t>
       </w:r>
     </w:p>
     <w:p>
       <w:pPr>
         <w:spacing w:before="220" w:after="90"/>
       </w:pPr>
+      <w:proofErr w:type="spellStart"/>
       <w:r>
         <w:rPr>
           <w:b/>
@@ -305,7 +420,62 @@
           <w:sz w:val="23"/>
           <w:szCs w:val="23"/>
         </w:rPr>
-        <w:t>Parte 1 · Ejecuta el build</w:t>
+        <w:t>Parte</w:t>
+      </w:r>
+      <w:proofErr w:type="spellEnd"/>
+      <w:r>
+        <w:rPr>
+          <w:b/>
+          <w:bCs/>
+          <w:color w:val="1F5C8B"/>
+          <w:sz w:val="23"/>
+          <w:szCs w:val="23"/>
+        </w:rPr>
+        <w:t xml:space="preserve"> 1 · </w:t>
+      </w:r>
+      <w:proofErr w:type="spellStart"/>
+      <w:r>
+        <w:rPr>
+          <w:b/>
+          <w:bCs/>
+          <w:color w:val="1F5C8B"/>
+          <w:sz w:val="23"/>
+          <w:szCs w:val="23"/>
+        </w:rPr>
+        <w:t>Ejecuta</w:t>
+      </w:r>
+      <w:proofErr w:type="spellEnd"/>
+      <w:r>
+        <w:rPr>
+          <w:b/>
+          <w:bCs/>
+          <w:color w:val="1F5C8B"/>
+          <w:sz w:val="23"/>
+          <w:szCs w:val="23"/>
+        </w:rPr>
+        <w:t xml:space="preserve"> </w:t>
+      </w:r>
+      <w:proofErr w:type="spellStart"/>
+      <w:r>
+        <w:rPr>
+          <w:b/>
+          <w:bCs/>
+          <w:color w:val="1F5C8B"/>
+          <w:sz w:val="23"/>
+          <w:szCs w:val="23"/>
+        </w:rPr>
+        <w:t>el</w:t>
+      </w:r>
+      <w:proofErr w:type="spellEnd"/>
+      <w:r>
+        <w:rPr>
+          <w:b/>
+          <w:bCs/>
+          <w:color w:val="1F5C8B"/>
+          <w:sz w:val="23"/>
+          <w:szCs w:val="23"/>
+        </w:rPr>
+        <w:t xml:space="preserve"> build</w:t>
       </w:r>
     </w:p>
     <w:tbl>
@@ -347,14 +517,25 @@
             </w:tcMar>
           </w:tcPr>
           <w:p>
-            <w:r>
-              <w:rPr>
-                <w:rFonts w:ascii="Consolas" w:eastAsia="Consolas" w:hAnsi="Consolas" w:cs="Consolas"/>
-                <w:color w:val="1A1A1A"/>
-                <w:sz w:val="17"/>
-                <w:szCs w:val="17"/>
-              </w:rPr>
-              <w:t>mvn -B clean compile</w:t>
+            <w:proofErr w:type="spellStart"/>
+            <w:r>
+              <w:rPr>
+                <w:rFonts w:ascii="Consolas" w:eastAsia="Consolas" w:hAnsi="Consolas" w:cs="Consolas"/>
+                <w:color w:val="1A1A1A"/>
+                <w:sz w:val="17"/>
+                <w:szCs w:val="17"/>
+              </w:rPr>
+              <w:t>mvn</w:t>
+            </w:r>
+            <w:proofErr w:type="spellEnd"/>
+            <w:r>
+              <w:rPr>
+                <w:rFonts w:ascii="Consolas" w:eastAsia="Consolas" w:hAnsi="Consolas" w:cs="Consolas"/>
+                <w:color w:val="1A1A1A"/>
+                <w:sz w:val="17"/>
+                <w:szCs w:val="17"/>
+              </w:rPr>
+              <w:t xml:space="preserve"> -B clean compile</w:t>
             </w:r>
           </w:p>
         </w:tc>
@@ -406,7 +587,39 @@
           <w:color w:val="1A1A1A"/>
           <w:lang w:val="es-ES"/>
         </w:rPr>
-        <w:t>El mensaje habla del paquete org.junit.jupiter.api. Abre pom.xml y busca la dependencia de JUnit antes de responder.</w:t>
+        <w:t xml:space="preserve">El mensaje habla del paquete </w:t>
+      </w:r>
+      <w:proofErr w:type="spellStart"/>
+      <w:r>
+        <w:rPr>
+          <w:color w:val="1A1A1A"/>
+          <w:lang w:val="es-ES"/>
+        </w:rPr>
+        <w:t>org.junit.jupiter.api</w:t>
+      </w:r>
+      <w:proofErr w:type="spellEnd"/>
+      <w:r>
+        <w:rPr>
+          <w:color w:val="1A1A1A"/>
+          <w:lang w:val="es-ES"/>
+        </w:rPr>
+        <w:t xml:space="preserve">. Abre pom.xml y busca la dependencia de </w:t>
+      </w:r>
+      <w:proofErr w:type="spellStart"/>
+      <w:r>
+        <w:rPr>
+          <w:color w:val="1A1A1A"/>
+          <w:lang w:val="es-ES"/>
+        </w:rPr>
+        <w:t>JUnit</w:t>
+      </w:r>
+      <w:proofErr w:type="spellEnd"/>
+      <w:r>
+        <w:rPr>
+          <w:color w:val="1A1A1A"/>
+          <w:lang w:val="es-ES"/>
+        </w:rPr>
+        <w:t xml:space="preserve"> antes de responder.</w:t>
       </w:r>
     </w:p>
     <w:p>
@@ -430,7 +643,55 @@
           <w:color w:val="1A1A1A"/>
           <w:lang w:val="es-ES"/>
         </w:rPr>
-        <w:t>¿Qué dice la etiqueta &lt;scope&gt; de esa dependencia y qué significa para el código de src/main/java?</w:t>
+        <w:t>¿Qué dice la etiqueta &lt;</w:t>
+      </w:r>
+      <w:proofErr w:type="spellStart"/>
+      <w:r>
+        <w:rPr>
+          <w:color w:val="1A1A1A"/>
+          <w:lang w:val="es-ES"/>
+        </w:rPr>
+        <w:t>scope</w:t>
+      </w:r>
+      <w:proofErr w:type="spellEnd"/>
+      <w:r>
+        <w:rPr>
+          <w:color w:val="1A1A1A"/>
+          <w:lang w:val="es-ES"/>
+        </w:rPr>
+        <w:t xml:space="preserve">&gt; de esa dependencia y qué significa para el código de </w:t>
+      </w:r>
+      <w:proofErr w:type="spellStart"/>
+      <w:r>
+        <w:rPr>
+          <w:color w:val="1A1A1A"/>
+          <w:lang w:val="es-ES"/>
+        </w:rPr>
+        <w:t>src</w:t>
+      </w:r>
+      <w:proofErr w:type="spellEnd"/>
+      <w:r>
+        <w:rPr>
+          <w:color w:val="1A1A1A"/>
+          <w:lang w:val="es-ES"/>
+        </w:rPr>
+        <w:t>/</w:t>
+      </w:r>
+      <w:proofErr w:type="spellStart"/>
+      <w:r>
+        <w:rPr>
+          <w:color w:val="1A1A1A"/>
+          <w:lang w:val="es-ES"/>
+        </w:rPr>
+        <w:t>main</w:t>
+      </w:r>
+      <w:proofErr w:type="spellEnd"/>
+      <w:r>
+        <w:rPr>
+          <w:color w:val="1A1A1A"/>
+          <w:lang w:val="es-ES"/>
+        </w:rPr>
+        <w:t>/java?</w:t>
       </w:r>
     </w:p>
     <w:p>
@@ -444,11 +705,207 @@
         </w:rPr>
       </w:pPr>
       <w:r>
-        <w:rPr>
-          <w:color w:val="1A1A1A"/>
-          <w:lang w:val="es-ES"/>
-        </w:rPr>
-        <w:t xml:space="preserve"> </w:t>
+        <w:t xml:space="preserve">La </w:t>
+      </w:r>
+      <w:proofErr w:type="spellStart"/>
+      <w:r>
+        <w:t>etiqueta</w:t>
+      </w:r>
+      <w:proofErr w:type="spellEnd"/>
+      <w:r>
+        <w:t xml:space="preserve"> &lt;scope&gt; dice test. </w:t>
+      </w:r>
+      <w:proofErr w:type="spellStart"/>
+      <w:r>
+        <w:t>Esto</w:t>
+      </w:r>
+      <w:proofErr w:type="spellEnd"/>
+      <w:r>
+        <w:t xml:space="preserve"> </w:t>
+      </w:r>
+      <w:proofErr w:type="spellStart"/>
+      <w:r>
+        <w:t>significa</w:t>
+      </w:r>
+      <w:proofErr w:type="spellEnd"/>
+      <w:r>
+        <w:t xml:space="preserve"> que la </w:t>
+      </w:r>
+      <w:proofErr w:type="spellStart"/>
+      <w:r>
+        <w:t>dependencia</w:t>
+      </w:r>
+      <w:proofErr w:type="spellEnd"/>
+      <w:r>
+        <w:t xml:space="preserve"> de JUnit solo </w:t>
+      </w:r>
+      <w:proofErr w:type="spellStart"/>
+      <w:r>
+        <w:t>está</w:t>
+      </w:r>
+      <w:proofErr w:type="spellEnd"/>
+      <w:r>
+        <w:t xml:space="preserve"> disponible </w:t>
+      </w:r>
+      <w:proofErr w:type="spellStart"/>
+      <w:r>
+        <w:t>en</w:t>
+      </w:r>
+      <w:proofErr w:type="spellEnd"/>
+      <w:r>
+        <w:t xml:space="preserve"> </w:t>
+      </w:r>
+      <w:proofErr w:type="spellStart"/>
+      <w:r>
+        <w:t>el</w:t>
+      </w:r>
+      <w:proofErr w:type="spellEnd"/>
+      <w:r>
+        <w:t xml:space="preserve"> </w:t>
+      </w:r>
+      <w:proofErr w:type="spellStart"/>
+      <w:r>
+        <w:t>classpath</w:t>
+      </w:r>
+      <w:proofErr w:type="spellEnd"/>
+      <w:r>
+        <w:t xml:space="preserve"> de </w:t>
+      </w:r>
+      <w:proofErr w:type="spellStart"/>
+      <w:r>
+        <w:t>pruebas</w:t>
+      </w:r>
+      <w:proofErr w:type="spellEnd"/>
+      <w:r>
+        <w:t xml:space="preserve"> (</w:t>
+      </w:r>
+      <w:proofErr w:type="spellStart"/>
+      <w:r>
+        <w:t>src</w:t>
+      </w:r>
+      <w:proofErr w:type="spellEnd"/>
+      <w:r>
+        <w:t xml:space="preserve">/test/java) y no </w:t>
+      </w:r>
+      <w:proofErr w:type="spellStart"/>
+      <w:r>
+        <w:t>en</w:t>
+      </w:r>
+      <w:proofErr w:type="spellEnd"/>
+      <w:r>
+        <w:t xml:space="preserve"> </w:t>
+      </w:r>
+      <w:proofErr w:type="spellStart"/>
+      <w:r>
+        <w:t>el</w:t>
+      </w:r>
+      <w:proofErr w:type="spellEnd"/>
+      <w:r>
+        <w:t xml:space="preserve"> </w:t>
+      </w:r>
+      <w:proofErr w:type="spellStart"/>
+      <w:r>
+        <w:t>classpath</w:t>
+      </w:r>
+      <w:proofErr w:type="spellEnd"/>
+      <w:r>
+        <w:t xml:space="preserve"> de </w:t>
+      </w:r>
+      <w:proofErr w:type="spellStart"/>
+      <w:r>
+        <w:t>compilación</w:t>
+      </w:r>
+      <w:proofErr w:type="spellEnd"/>
+      <w:r>
+        <w:t xml:space="preserve"> principal (</w:t>
+      </w:r>
+      <w:proofErr w:type="spellStart"/>
+      <w:r>
+        <w:t>src</w:t>
+      </w:r>
+      <w:proofErr w:type="spellEnd"/>
+      <w:r>
+        <w:t xml:space="preserve">/main/java). Por lo tanto, </w:t>
+      </w:r>
+      <w:proofErr w:type="spellStart"/>
+      <w:r>
+        <w:t>cualquier</w:t>
+      </w:r>
+      <w:proofErr w:type="spellEnd"/>
+      <w:r>
+        <w:t xml:space="preserve"> </w:t>
+      </w:r>
+      <w:proofErr w:type="spellStart"/>
+      <w:r>
+        <w:t>clase</w:t>
+      </w:r>
+      <w:proofErr w:type="spellEnd"/>
+      <w:r>
+        <w:t xml:space="preserve"> </w:t>
+      </w:r>
+      <w:proofErr w:type="spellStart"/>
+      <w:r>
+        <w:t>en</w:t>
+      </w:r>
+      <w:proofErr w:type="spellEnd"/>
+      <w:r>
+        <w:t xml:space="preserve"> </w:t>
+      </w:r>
+      <w:proofErr w:type="spellStart"/>
+      <w:r>
+        <w:t>src</w:t>
+      </w:r>
+      <w:proofErr w:type="spellEnd"/>
+      <w:r>
+        <w:t xml:space="preserve">/main/java que </w:t>
+      </w:r>
+      <w:proofErr w:type="spellStart"/>
+      <w:r>
+        <w:t>intente</w:t>
+      </w:r>
+      <w:proofErr w:type="spellEnd"/>
+      <w:r>
+        <w:t xml:space="preserve"> </w:t>
+      </w:r>
+      <w:proofErr w:type="spellStart"/>
+      <w:r>
+        <w:t>importar</w:t>
+      </w:r>
+      <w:proofErr w:type="spellEnd"/>
+      <w:r>
+        <w:t xml:space="preserve"> </w:t>
+      </w:r>
+      <w:proofErr w:type="spellStart"/>
+      <w:r>
+        <w:t>clases</w:t>
+      </w:r>
+      <w:proofErr w:type="spellEnd"/>
+      <w:r>
+        <w:t xml:space="preserve"> de JUnit no las </w:t>
+      </w:r>
+      <w:proofErr w:type="spellStart"/>
+      <w:r>
+        <w:t>encontrará</w:t>
+      </w:r>
+      <w:proofErr w:type="spellEnd"/>
+      <w:r>
+        <w:t xml:space="preserve"> y la </w:t>
+      </w:r>
+      <w:proofErr w:type="spellStart"/>
+      <w:r>
+        <w:t>compilación</w:t>
+      </w:r>
+      <w:proofErr w:type="spellEnd"/>
+      <w:r>
+        <w:t xml:space="preserve"> </w:t>
+      </w:r>
+      <w:proofErr w:type="spellStart"/>
+      <w:r>
+        <w:t>fallará</w:t>
+      </w:r>
+      <w:proofErr w:type="spellEnd"/>
+      <w:r>
+        <w:t>.</w:t>
       </w:r>
     </w:p>
     <w:p>
@@ -461,13 +918,6 @@
           <w:lang w:val="es-ES"/>
         </w:rPr>
       </w:pPr>
-      <w:r>
-        <w:rPr>
-          <w:color w:val="1A1A1A"/>
-          <w:lang w:val="es-ES"/>
-        </w:rPr>
-        <w:t xml:space="preserve"> </w:t>
-      </w:r>
     </w:p>
     <w:p>
       <w:pPr>
@@ -504,11 +954,159 @@
         </w:rPr>
       </w:pPr>
       <w:r>
-        <w:rPr>
-          <w:color w:val="1A1A1A"/>
-          <w:lang w:val="es-ES"/>
-        </w:rPr>
-        <w:t xml:space="preserve"> </w:t>
+        <w:t xml:space="preserve">El </w:t>
+      </w:r>
+      <w:proofErr w:type="spellStart"/>
+      <w:r>
+        <w:t>archivo</w:t>
+      </w:r>
+      <w:proofErr w:type="spellEnd"/>
+      <w:r>
+        <w:t xml:space="preserve"> DescuentoSmokeTest.java </w:t>
+      </w:r>
+      <w:proofErr w:type="spellStart"/>
+      <w:r>
+        <w:t>está</w:t>
+      </w:r>
+      <w:proofErr w:type="spellEnd"/>
+      <w:r>
+        <w:t xml:space="preserve"> mal </w:t>
+      </w:r>
+      <w:proofErr w:type="spellStart"/>
+      <w:r>
+        <w:t>ubicado</w:t>
+      </w:r>
+      <w:proofErr w:type="spellEnd"/>
+      <w:r>
+        <w:t xml:space="preserve">. Se </w:t>
+      </w:r>
+      <w:proofErr w:type="spellStart"/>
+      <w:r>
+        <w:t>encuentra</w:t>
+      </w:r>
+      <w:proofErr w:type="spellEnd"/>
+      <w:r>
+        <w:t xml:space="preserve"> </w:t>
+      </w:r>
+      <w:proofErr w:type="spellStart"/>
+      <w:r>
+        <w:t>en</w:t>
+      </w:r>
+      <w:proofErr w:type="spellEnd"/>
+      <w:r>
+        <w:t xml:space="preserve"> </w:t>
+      </w:r>
+      <w:proofErr w:type="spellStart"/>
+      <w:r>
+        <w:t>src</w:t>
+      </w:r>
+      <w:proofErr w:type="spellEnd"/>
+      <w:r>
+        <w:t>/main/java/mx/</w:t>
+      </w:r>
+      <w:proofErr w:type="spellStart"/>
+      <w:r>
+        <w:t>itson</w:t>
+      </w:r>
+      <w:proofErr w:type="spellEnd"/>
+      <w:r>
+        <w:t>/</w:t>
+      </w:r>
+      <w:proofErr w:type="spellStart"/>
+      <w:r>
+        <w:t>devops</w:t>
+      </w:r>
+      <w:proofErr w:type="spellEnd"/>
+      <w:r>
+        <w:t>/</w:t>
+      </w:r>
+      <w:proofErr w:type="spellStart"/>
+      <w:r>
+        <w:t>descuento</w:t>
+      </w:r>
+      <w:proofErr w:type="spellEnd"/>
+      <w:r>
+        <w:t xml:space="preserve">/ </w:t>
+      </w:r>
+      <w:proofErr w:type="spellStart"/>
+      <w:r>
+        <w:t>pero</w:t>
+      </w:r>
+      <w:proofErr w:type="spellEnd"/>
+      <w:r>
+        <w:t xml:space="preserve">, al ser </w:t>
+      </w:r>
+      <w:proofErr w:type="spellStart"/>
+      <w:r>
+        <w:t>una</w:t>
+      </w:r>
+      <w:proofErr w:type="spellEnd"/>
+      <w:r>
+        <w:t xml:space="preserve"> </w:t>
+      </w:r>
+      <w:proofErr w:type="spellStart"/>
+      <w:r>
+        <w:t>clase</w:t>
+      </w:r>
+      <w:proofErr w:type="spellEnd"/>
+      <w:r>
+        <w:t xml:space="preserve"> de </w:t>
+      </w:r>
+      <w:proofErr w:type="spellStart"/>
+      <w:r>
+        <w:t>prueba</w:t>
+      </w:r>
+      <w:proofErr w:type="spellEnd"/>
+      <w:r>
+        <w:t xml:space="preserve"> que </w:t>
+      </w:r>
+      <w:proofErr w:type="spellStart"/>
+      <w:r>
+        <w:t>usa</w:t>
+      </w:r>
+      <w:proofErr w:type="spellEnd"/>
+      <w:r>
+        <w:t xml:space="preserve"> JUnit, </w:t>
+      </w:r>
+      <w:proofErr w:type="spellStart"/>
+      <w:r>
+        <w:t>pertenece</w:t>
+      </w:r>
+      <w:proofErr w:type="spellEnd"/>
+      <w:r>
+        <w:t xml:space="preserve"> a </w:t>
+      </w:r>
+      <w:proofErr w:type="spellStart"/>
+      <w:r>
+        <w:t>src</w:t>
+      </w:r>
+      <w:proofErr w:type="spellEnd"/>
+      <w:r>
+        <w:t>/test/java/mx/</w:t>
+      </w:r>
+      <w:proofErr w:type="spellStart"/>
+      <w:r>
+        <w:t>itson</w:t>
+      </w:r>
+      <w:proofErr w:type="spellEnd"/>
+      <w:r>
+        <w:t>/</w:t>
+      </w:r>
+      <w:proofErr w:type="spellStart"/>
+      <w:r>
+        <w:t>devops</w:t>
+      </w:r>
+      <w:proofErr w:type="spellEnd"/>
+      <w:r>
+        <w:t>/</w:t>
+      </w:r>
+      <w:proofErr w:type="spellStart"/>
+      <w:r>
+        <w:t>descuento</w:t>
+      </w:r>
+      <w:proofErr w:type="spellEnd"/>
+      <w:r>
+        <w:t>/.</w:t>
       </w:r>
     </w:p>
     <w:p>
@@ -521,13 +1119,6 @@
           <w:lang w:val="es-ES"/>
         </w:rPr>
       </w:pPr>
-      <w:r>
-        <w:rPr>
-          <w:color w:val="1A1A1A"/>
-          <w:lang w:val="es-ES"/>
-        </w:rPr>
-        <w:t xml:space="preserve"> </w:t>
-      </w:r>
     </w:p>
     <w:p>
       <w:pPr>
@@ -541,7 +1132,23 @@
           <w:color w:val="1A1A1A"/>
           <w:lang w:val="es-ES"/>
         </w:rPr>
-        <w:t>Muévelo (no quites el scope, no muevas la dependencia) y vuelve a compilar:</w:t>
+        <w:t xml:space="preserve">Muévelo (no quites el </w:t>
+      </w:r>
+      <w:proofErr w:type="spellStart"/>
+      <w:r>
+        <w:rPr>
+          <w:color w:val="1A1A1A"/>
+          <w:lang w:val="es-ES"/>
+        </w:rPr>
+        <w:t>scope</w:t>
+      </w:r>
+      <w:proofErr w:type="spellEnd"/>
+      <w:r>
+        <w:rPr>
+          <w:color w:val="1A1A1A"/>
+          <w:lang w:val="es-ES"/>
+        </w:rPr>
+        <w:t>, no muevas la dependencia) y vuelve a compilar:</w:t>
       </w:r>
     </w:p>
     <w:tbl>
@@ -605,6 +1212,7 @@
                 <w:lang w:val="es-ES"/>
               </w:rPr>
             </w:pPr>
+            <w:proofErr w:type="spellStart"/>
             <w:r>
               <w:rPr>
                 <w:rFonts w:ascii="Consolas" w:eastAsia="Consolas" w:hAnsi="Consolas" w:cs="Consolas"/>
@@ -613,7 +1221,128 @@
                 <w:szCs w:val="17"/>
                 <w:lang w:val="es-ES"/>
               </w:rPr>
-              <w:t>mv src/main/java/mx/itson/devops/descuento/DescuentoSmokeTest.java \</w:t>
+              <w:t>mv</w:t>
+            </w:r>
+            <w:proofErr w:type="spellEnd"/>
+            <w:r>
+              <w:rPr>
+                <w:rFonts w:ascii="Consolas" w:eastAsia="Consolas" w:hAnsi="Consolas" w:cs="Consolas"/>
+                <w:color w:val="1A1A1A"/>
+                <w:sz w:val="17"/>
+                <w:szCs w:val="17"/>
+                <w:lang w:val="es-ES"/>
+              </w:rPr>
+              <w:t xml:space="preserve"> </w:t>
+            </w:r>
+            <w:proofErr w:type="spellStart"/>
+            <w:r>
+              <w:rPr>
+                <w:rFonts w:ascii="Consolas" w:eastAsia="Consolas" w:hAnsi="Consolas" w:cs="Consolas"/>
+                <w:color w:val="1A1A1A"/>
+                <w:sz w:val="17"/>
+                <w:szCs w:val="17"/>
+                <w:lang w:val="es-ES"/>
+              </w:rPr>
+              <w:t>src</w:t>
+            </w:r>
+            <w:proofErr w:type="spellEnd"/>
+            <w:r>
+              <w:rPr>
+                <w:rFonts w:ascii="Consolas" w:eastAsia="Consolas" w:hAnsi="Consolas" w:cs="Consolas"/>
+                <w:color w:val="1A1A1A"/>
+                <w:sz w:val="17"/>
+                <w:szCs w:val="17"/>
+                <w:lang w:val="es-ES"/>
+              </w:rPr>
+              <w:t>/</w:t>
+            </w:r>
+            <w:proofErr w:type="spellStart"/>
+            <w:r>
+              <w:rPr>
+                <w:rFonts w:ascii="Consolas" w:eastAsia="Consolas" w:hAnsi="Consolas" w:cs="Consolas"/>
+                <w:color w:val="1A1A1A"/>
+                <w:sz w:val="17"/>
+                <w:szCs w:val="17"/>
+                <w:lang w:val="es-ES"/>
+              </w:rPr>
+              <w:t>main</w:t>
+            </w:r>
+            <w:proofErr w:type="spellEnd"/>
+            <w:r>
+              <w:rPr>
+                <w:rFonts w:ascii="Consolas" w:eastAsia="Consolas" w:hAnsi="Consolas" w:cs="Consolas"/>
+                <w:color w:val="1A1A1A"/>
+                <w:sz w:val="17"/>
+                <w:szCs w:val="17"/>
+                <w:lang w:val="es-ES"/>
+              </w:rPr>
+              <w:t>/java/</w:t>
+            </w:r>
+            <w:proofErr w:type="spellStart"/>
+            <w:r>
+              <w:rPr>
+                <w:rFonts w:ascii="Consolas" w:eastAsia="Consolas" w:hAnsi="Consolas" w:cs="Consolas"/>
+                <w:color w:val="1A1A1A"/>
+                <w:sz w:val="17"/>
+                <w:szCs w:val="17"/>
+                <w:lang w:val="es-ES"/>
+              </w:rPr>
+              <w:t>mx</w:t>
+            </w:r>
+            <w:proofErr w:type="spellEnd"/>
+            <w:r>
+              <w:rPr>
+                <w:rFonts w:ascii="Consolas" w:eastAsia="Consolas" w:hAnsi="Consolas" w:cs="Consolas"/>
+                <w:color w:val="1A1A1A"/>
+                <w:sz w:val="17"/>
+                <w:szCs w:val="17"/>
+                <w:lang w:val="es-ES"/>
+              </w:rPr>
+              <w:t>/</w:t>
+            </w:r>
+            <w:proofErr w:type="spellStart"/>
+            <w:r>
+              <w:rPr>
+                <w:rFonts w:ascii="Consolas" w:eastAsia="Consolas" w:hAnsi="Consolas" w:cs="Consolas"/>
+                <w:color w:val="1A1A1A"/>
+                <w:sz w:val="17"/>
+                <w:szCs w:val="17"/>
+                <w:lang w:val="es-ES"/>
+              </w:rPr>
+              <w:t>itson</w:t>
+            </w:r>
+            <w:proofErr w:type="spellEnd"/>
+            <w:r>
+              <w:rPr>
+                <w:rFonts w:ascii="Consolas" w:eastAsia="Consolas" w:hAnsi="Consolas" w:cs="Consolas"/>
+                <w:color w:val="1A1A1A"/>
+                <w:sz w:val="17"/>
+                <w:szCs w:val="17"/>
+                <w:lang w:val="es-ES"/>
+              </w:rPr>
+              <w:t>/</w:t>
+            </w:r>
+            <w:proofErr w:type="spellStart"/>
+            <w:r>
+              <w:rPr>
+                <w:rFonts w:ascii="Consolas" w:eastAsia="Consolas" w:hAnsi="Consolas" w:cs="Consolas"/>
+                <w:color w:val="1A1A1A"/>
+                <w:sz w:val="17"/>
+                <w:szCs w:val="17"/>
+                <w:lang w:val="es-ES"/>
+              </w:rPr>
+              <w:t>devops</w:t>
+            </w:r>
+            <w:proofErr w:type="spellEnd"/>
+            <w:r>
+              <w:rPr>
+                <w:rFonts w:ascii="Consolas" w:eastAsia="Consolas" w:hAnsi="Consolas" w:cs="Consolas"/>
+                <w:color w:val="1A1A1A"/>
+                <w:sz w:val="17"/>
+                <w:szCs w:val="17"/>
+                <w:lang w:val="es-ES"/>
+              </w:rPr>
+              <w:t>/descuento/DescuentoSmokeTest.java \</w:t>
             </w:r>
           </w:p>
           <w:p>
@@ -627,14 +1356,85 @@
               </w:rPr>
               <w:t xml:space="preserve">   </w:t>
             </w:r>
-            <w:r>
-              <w:rPr>
-                <w:rFonts w:ascii="Consolas" w:eastAsia="Consolas" w:hAnsi="Consolas" w:cs="Consolas"/>
-                <w:color w:val="1A1A1A"/>
-                <w:sz w:val="17"/>
-                <w:szCs w:val="17"/>
-              </w:rPr>
-              <w:t>src/test/java/mx/itson/devops/descuento/</w:t>
+            <w:proofErr w:type="spellStart"/>
+            <w:r>
+              <w:rPr>
+                <w:rFonts w:ascii="Consolas" w:eastAsia="Consolas" w:hAnsi="Consolas" w:cs="Consolas"/>
+                <w:color w:val="1A1A1A"/>
+                <w:sz w:val="17"/>
+                <w:szCs w:val="17"/>
+              </w:rPr>
+              <w:t>src</w:t>
+            </w:r>
+            <w:proofErr w:type="spellEnd"/>
+            <w:r>
+              <w:rPr>
+                <w:rFonts w:ascii="Consolas" w:eastAsia="Consolas" w:hAnsi="Consolas" w:cs="Consolas"/>
+                <w:color w:val="1A1A1A"/>
+                <w:sz w:val="17"/>
+                <w:szCs w:val="17"/>
+              </w:rPr>
+              <w:t>/test/java/mx/</w:t>
+            </w:r>
+            <w:proofErr w:type="spellStart"/>
+            <w:r>
+              <w:rPr>
+                <w:rFonts w:ascii="Consolas" w:eastAsia="Consolas" w:hAnsi="Consolas" w:cs="Consolas"/>
+                <w:color w:val="1A1A1A"/>
+                <w:sz w:val="17"/>
+                <w:szCs w:val="17"/>
+              </w:rPr>
+              <w:t>itson</w:t>
+            </w:r>
+            <w:proofErr w:type="spellEnd"/>
+            <w:r>
+              <w:rPr>
+                <w:rFonts w:ascii="Consolas" w:eastAsia="Consolas" w:hAnsi="Consolas" w:cs="Consolas"/>
+                <w:color w:val="1A1A1A"/>
+                <w:sz w:val="17"/>
+                <w:szCs w:val="17"/>
+              </w:rPr>
+              <w:t>/</w:t>
+            </w:r>
+            <w:proofErr w:type="spellStart"/>
+            <w:r>
+              <w:rPr>
+                <w:rFonts w:ascii="Consolas" w:eastAsia="Consolas" w:hAnsi="Consolas" w:cs="Consolas"/>
+                <w:color w:val="1A1A1A"/>
+                <w:sz w:val="17"/>
+                <w:szCs w:val="17"/>
+              </w:rPr>
+              <w:t>devops</w:t>
+            </w:r>
+            <w:proofErr w:type="spellEnd"/>
+            <w:r>
+              <w:rPr>
+                <w:rFonts w:ascii="Consolas" w:eastAsia="Consolas" w:hAnsi="Consolas" w:cs="Consolas"/>
+                <w:color w:val="1A1A1A"/>
+                <w:sz w:val="17"/>
+                <w:szCs w:val="17"/>
+              </w:rPr>
+              <w:t>/</w:t>
+            </w:r>
+            <w:proofErr w:type="spellStart"/>
+            <w:r>
+              <w:rPr>
+                <w:rFonts w:ascii="Consolas" w:eastAsia="Consolas" w:hAnsi="Consolas" w:cs="Consolas"/>
+                <w:color w:val="1A1A1A"/>
+                <w:sz w:val="17"/>
+                <w:szCs w:val="17"/>
+              </w:rPr>
+              <w:t>descuento</w:t>
+            </w:r>
+            <w:proofErr w:type="spellEnd"/>
+            <w:r>
+              <w:rPr>
+                <w:rFonts w:ascii="Consolas" w:eastAsia="Consolas" w:hAnsi="Consolas" w:cs="Consolas"/>
+                <w:color w:val="1A1A1A"/>
+                <w:sz w:val="17"/>
+                <w:szCs w:val="17"/>
+              </w:rPr>
+              <w:t>/</w:t>
             </w:r>
           </w:p>
           <w:p>
@@ -667,7 +1467,87 @@
                 <w:sz w:val="17"/>
                 <w:szCs w:val="17"/>
               </w:rPr>
-              <w:t>Move-Item src\main\java\mx\itson\devops\descuento\DescuentoSmokeTest.java `</w:t>
+              <w:t xml:space="preserve">Move-Item </w:t>
+            </w:r>
+            <w:proofErr w:type="spellStart"/>
+            <w:r>
+              <w:rPr>
+                <w:rFonts w:ascii="Consolas" w:eastAsia="Consolas" w:hAnsi="Consolas" w:cs="Consolas"/>
+                <w:color w:val="1A1A1A"/>
+                <w:sz w:val="17"/>
+                <w:szCs w:val="17"/>
+              </w:rPr>
+              <w:t>src</w:t>
+            </w:r>
+            <w:proofErr w:type="spellEnd"/>
+            <w:r>
+              <w:rPr>
+                <w:rFonts w:ascii="Consolas" w:eastAsia="Consolas" w:hAnsi="Consolas" w:cs="Consolas"/>
+                <w:color w:val="1A1A1A"/>
+                <w:sz w:val="17"/>
+                <w:szCs w:val="17"/>
+              </w:rPr>
+              <w:t>\main\java\mx\</w:t>
+            </w:r>
+            <w:proofErr w:type="spellStart"/>
+            <w:r>
+              <w:rPr>
+                <w:rFonts w:ascii="Consolas" w:eastAsia="Consolas" w:hAnsi="Consolas" w:cs="Consolas"/>
+                <w:color w:val="1A1A1A"/>
+                <w:sz w:val="17"/>
+                <w:szCs w:val="17"/>
+              </w:rPr>
+              <w:t>itson</w:t>
+            </w:r>
+            <w:proofErr w:type="spellEnd"/>
+            <w:r>
+              <w:rPr>
+                <w:rFonts w:ascii="Consolas" w:eastAsia="Consolas" w:hAnsi="Consolas" w:cs="Consolas"/>
+                <w:color w:val="1A1A1A"/>
+                <w:sz w:val="17"/>
+                <w:szCs w:val="17"/>
+              </w:rPr>
+              <w:t>\</w:t>
+            </w:r>
+            <w:proofErr w:type="spellStart"/>
+            <w:r>
+              <w:rPr>
+                <w:rFonts w:ascii="Consolas" w:eastAsia="Consolas" w:hAnsi="Consolas" w:cs="Consolas"/>
+                <w:color w:val="1A1A1A"/>
+                <w:sz w:val="17"/>
+                <w:szCs w:val="17"/>
+              </w:rPr>
+              <w:t>devops</w:t>
+            </w:r>
+            <w:proofErr w:type="spellEnd"/>
+            <w:r>
+              <w:rPr>
+                <w:rFonts w:ascii="Consolas" w:eastAsia="Consolas" w:hAnsi="Consolas" w:cs="Consolas"/>
+                <w:color w:val="1A1A1A"/>
+                <w:sz w:val="17"/>
+                <w:szCs w:val="17"/>
+              </w:rPr>
+              <w:t>\</w:t>
+            </w:r>
+            <w:proofErr w:type="spellStart"/>
+            <w:r>
+              <w:rPr>
+                <w:rFonts w:ascii="Consolas" w:eastAsia="Consolas" w:hAnsi="Consolas" w:cs="Consolas"/>
+                <w:color w:val="1A1A1A"/>
+                <w:sz w:val="17"/>
+                <w:szCs w:val="17"/>
+              </w:rPr>
+              <w:t>descuento</w:t>
+            </w:r>
+            <w:proofErr w:type="spellEnd"/>
+            <w:r>
+              <w:rPr>
+                <w:rFonts w:ascii="Consolas" w:eastAsia="Consolas" w:hAnsi="Consolas" w:cs="Consolas"/>
+                <w:color w:val="1A1A1A"/>
+                <w:sz w:val="17"/>
+                <w:szCs w:val="17"/>
+              </w:rPr>
+              <w:t>\DescuentoSmokeTest.java `</w:t>
             </w:r>
           </w:p>
           <w:p>
@@ -678,7 +1558,87 @@
                 <w:sz w:val="17"/>
                 <w:szCs w:val="17"/>
               </w:rPr>
-              <w:t xml:space="preserve">          src\test\java\mx\itson\devops\descuento\</w:t>
+              <w:t xml:space="preserve">          </w:t>
+            </w:r>
+            <w:proofErr w:type="spellStart"/>
+            <w:r>
+              <w:rPr>
+                <w:rFonts w:ascii="Consolas" w:eastAsia="Consolas" w:hAnsi="Consolas" w:cs="Consolas"/>
+                <w:color w:val="1A1A1A"/>
+                <w:sz w:val="17"/>
+                <w:szCs w:val="17"/>
+              </w:rPr>
+              <w:t>src</w:t>
+            </w:r>
+            <w:proofErr w:type="spellEnd"/>
+            <w:r>
+              <w:rPr>
+                <w:rFonts w:ascii="Consolas" w:eastAsia="Consolas" w:hAnsi="Consolas" w:cs="Consolas"/>
+                <w:color w:val="1A1A1A"/>
+                <w:sz w:val="17"/>
+                <w:szCs w:val="17"/>
+              </w:rPr>
+              <w:t>\test\java\mx\</w:t>
+            </w:r>
+            <w:proofErr w:type="spellStart"/>
+            <w:r>
+              <w:rPr>
+                <w:rFonts w:ascii="Consolas" w:eastAsia="Consolas" w:hAnsi="Consolas" w:cs="Consolas"/>
+                <w:color w:val="1A1A1A"/>
+                <w:sz w:val="17"/>
+                <w:szCs w:val="17"/>
+              </w:rPr>
+              <w:t>itson</w:t>
+            </w:r>
+            <w:proofErr w:type="spellEnd"/>
+            <w:r>
+              <w:rPr>
+                <w:rFonts w:ascii="Consolas" w:eastAsia="Consolas" w:hAnsi="Consolas" w:cs="Consolas"/>
+                <w:color w:val="1A1A1A"/>
+                <w:sz w:val="17"/>
+                <w:szCs w:val="17"/>
+              </w:rPr>
+              <w:t>\</w:t>
+            </w:r>
+            <w:proofErr w:type="spellStart"/>
+            <w:r>
+              <w:rPr>
+                <w:rFonts w:ascii="Consolas" w:eastAsia="Consolas" w:hAnsi="Consolas" w:cs="Consolas"/>
+                <w:color w:val="1A1A1A"/>
+                <w:sz w:val="17"/>
+                <w:szCs w:val="17"/>
+              </w:rPr>
+              <w:t>devops</w:t>
+            </w:r>
+            <w:proofErr w:type="spellEnd"/>
+            <w:r>
+              <w:rPr>
+                <w:rFonts w:ascii="Consolas" w:eastAsia="Consolas" w:hAnsi="Consolas" w:cs="Consolas"/>
+                <w:color w:val="1A1A1A"/>
+                <w:sz w:val="17"/>
+                <w:szCs w:val="17"/>
+              </w:rPr>
+              <w:t>\</w:t>
+            </w:r>
+            <w:proofErr w:type="spellStart"/>
+            <w:r>
+              <w:rPr>
+                <w:rFonts w:ascii="Consolas" w:eastAsia="Consolas" w:hAnsi="Consolas" w:cs="Consolas"/>
+                <w:color w:val="1A1A1A"/>
+                <w:sz w:val="17"/>
+                <w:szCs w:val="17"/>
+              </w:rPr>
+              <w:t>descuento</w:t>
+            </w:r>
+            <w:proofErr w:type="spellEnd"/>
+            <w:r>
+              <w:rPr>
+                <w:rFonts w:ascii="Consolas" w:eastAsia="Consolas" w:hAnsi="Consolas" w:cs="Consolas"/>
+                <w:color w:val="1A1A1A"/>
+                <w:sz w:val="17"/>
+                <w:szCs w:val="17"/>
+              </w:rPr>
+              <w:t>\</w:t>
             </w:r>
           </w:p>
           <w:p>
@@ -693,14 +1653,25 @@
             </w:r>
           </w:p>
           <w:p>
-            <w:r>
-              <w:rPr>
-                <w:rFonts w:ascii="Consolas" w:eastAsia="Consolas" w:hAnsi="Consolas" w:cs="Consolas"/>
-                <w:color w:val="1A1A1A"/>
-                <w:sz w:val="17"/>
-                <w:szCs w:val="17"/>
-              </w:rPr>
-              <w:t>mvn -B clean compile</w:t>
+            <w:proofErr w:type="spellStart"/>
+            <w:r>
+              <w:rPr>
+                <w:rFonts w:ascii="Consolas" w:eastAsia="Consolas" w:hAnsi="Consolas" w:cs="Consolas"/>
+                <w:color w:val="1A1A1A"/>
+                <w:sz w:val="17"/>
+                <w:szCs w:val="17"/>
+              </w:rPr>
+              <w:t>mvn</w:t>
+            </w:r>
+            <w:proofErr w:type="spellEnd"/>
+            <w:r>
+              <w:rPr>
+                <w:rFonts w:ascii="Consolas" w:eastAsia="Consolas" w:hAnsi="Consolas" w:cs="Consolas"/>
+                <w:color w:val="1A1A1A"/>
+                <w:sz w:val="17"/>
+                <w:szCs w:val="17"/>
+              </w:rPr>
+              <w:t xml:space="preserve"> -B clean compile</w:t>
             </w:r>
           </w:p>
         </w:tc>
@@ -727,7 +1698,39 @@
           <w:color w:val="1A1A1A"/>
           <w:lang w:val="es-ES"/>
         </w:rPr>
-        <w:t>Un compañero propone quitar &lt;scope&gt;test&lt;/scope&gt; del pom.xml: con eso también compila. ¿Por qué esa corrección es peor que la tuya?</w:t>
+        <w:t>Un compañero propone quitar &lt;</w:t>
+      </w:r>
+      <w:proofErr w:type="spellStart"/>
+      <w:r>
+        <w:rPr>
+          <w:color w:val="1A1A1A"/>
+          <w:lang w:val="es-ES"/>
+        </w:rPr>
+        <w:t>scope</w:t>
+      </w:r>
+      <w:proofErr w:type="spellEnd"/>
+      <w:r>
+        <w:rPr>
+          <w:color w:val="1A1A1A"/>
+          <w:lang w:val="es-ES"/>
+        </w:rPr>
+        <w:t>&gt;test&lt;/</w:t>
+      </w:r>
+      <w:proofErr w:type="spellStart"/>
+      <w:r>
+        <w:rPr>
+          <w:color w:val="1A1A1A"/>
+          <w:lang w:val="es-ES"/>
+        </w:rPr>
+        <w:t>scope</w:t>
+      </w:r>
+      <w:proofErr w:type="spellEnd"/>
+      <w:r>
+        <w:rPr>
+          <w:color w:val="1A1A1A"/>
+          <w:lang w:val="es-ES"/>
+        </w:rPr>
+        <w:t>&gt; del pom.xml: con eso también compila. ¿Por qué esa corrección es peor que la tuya?</w:t>
       </w:r>
     </w:p>
     <w:p>
@@ -740,12 +1743,357 @@
           <w:lang w:val="es-ES"/>
         </w:rPr>
       </w:pPr>
-      <w:r>
-        <w:rPr>
-          <w:color w:val="1A1A1A"/>
-          <w:lang w:val="es-ES"/>
-        </w:rPr>
-        <w:t xml:space="preserve"> </w:t>
+      <w:proofErr w:type="spellStart"/>
+      <w:r>
+        <w:t>Porque</w:t>
+      </w:r>
+      <w:proofErr w:type="spellEnd"/>
+      <w:r>
+        <w:t xml:space="preserve"> al </w:t>
+      </w:r>
+      <w:proofErr w:type="spellStart"/>
+      <w:r>
+        <w:t>quitar</w:t>
+      </w:r>
+      <w:proofErr w:type="spellEnd"/>
+      <w:r>
+        <w:t xml:space="preserve"> </w:t>
+      </w:r>
+      <w:proofErr w:type="spellStart"/>
+      <w:r>
+        <w:t>el</w:t>
+      </w:r>
+      <w:proofErr w:type="spellEnd"/>
+      <w:r>
+        <w:t xml:space="preserve"> scope test, JUnit </w:t>
+      </w:r>
+      <w:proofErr w:type="spellStart"/>
+      <w:r>
+        <w:t>pasaría</w:t>
+      </w:r>
+      <w:proofErr w:type="spellEnd"/>
+      <w:r>
+        <w:t xml:space="preserve"> a </w:t>
+      </w:r>
+      <w:proofErr w:type="spellStart"/>
+      <w:r>
+        <w:t>tener</w:t>
+      </w:r>
+      <w:proofErr w:type="spellEnd"/>
+      <w:r>
+        <w:t xml:space="preserve"> scope compile (</w:t>
+      </w:r>
+      <w:proofErr w:type="spellStart"/>
+      <w:r>
+        <w:t>el</w:t>
+      </w:r>
+      <w:proofErr w:type="spellEnd"/>
+      <w:r>
+        <w:t xml:space="preserve"> valor </w:t>
+      </w:r>
+      <w:proofErr w:type="spellStart"/>
+      <w:r>
+        <w:t>por</w:t>
+      </w:r>
+      <w:proofErr w:type="spellEnd"/>
+      <w:r>
+        <w:t xml:space="preserve"> </w:t>
+      </w:r>
+      <w:proofErr w:type="spellStart"/>
+      <w:r>
+        <w:t>defecto</w:t>
+      </w:r>
+      <w:proofErr w:type="spellEnd"/>
+      <w:r>
+        <w:t xml:space="preserve">), lo </w:t>
+      </w:r>
+      <w:proofErr w:type="spellStart"/>
+      <w:r>
+        <w:t>cual</w:t>
+      </w:r>
+      <w:proofErr w:type="spellEnd"/>
+      <w:r>
+        <w:t xml:space="preserve"> </w:t>
+      </w:r>
+      <w:proofErr w:type="spellStart"/>
+      <w:r>
+        <w:t>haría</w:t>
+      </w:r>
+      <w:proofErr w:type="spellEnd"/>
+      <w:r>
+        <w:t xml:space="preserve"> que JUnit se </w:t>
+      </w:r>
+      <w:proofErr w:type="spellStart"/>
+      <w:r>
+        <w:t>incluyera</w:t>
+      </w:r>
+      <w:proofErr w:type="spellEnd"/>
+      <w:r>
+        <w:t xml:space="preserve"> </w:t>
+      </w:r>
+      <w:proofErr w:type="spellStart"/>
+      <w:r>
+        <w:t>en</w:t>
+      </w:r>
+      <w:proofErr w:type="spellEnd"/>
+      <w:r>
+        <w:t xml:space="preserve"> </w:t>
+      </w:r>
+      <w:proofErr w:type="spellStart"/>
+      <w:r>
+        <w:t>el</w:t>
+      </w:r>
+      <w:proofErr w:type="spellEnd"/>
+      <w:r>
+        <w:t xml:space="preserve"> </w:t>
+      </w:r>
+      <w:proofErr w:type="spellStart"/>
+      <w:r>
+        <w:t>classpath</w:t>
+      </w:r>
+      <w:proofErr w:type="spellEnd"/>
+      <w:r>
+        <w:t xml:space="preserve"> de </w:t>
+      </w:r>
+      <w:proofErr w:type="spellStart"/>
+      <w:r>
+        <w:t>producción</w:t>
+      </w:r>
+      <w:proofErr w:type="spellEnd"/>
+      <w:r>
+        <w:t xml:space="preserve"> y </w:t>
+      </w:r>
+      <w:proofErr w:type="spellStart"/>
+      <w:r>
+        <w:t>podría</w:t>
+      </w:r>
+      <w:proofErr w:type="spellEnd"/>
+      <w:r>
+        <w:t xml:space="preserve"> </w:t>
+      </w:r>
+      <w:proofErr w:type="spellStart"/>
+      <w:r>
+        <w:t>terminar</w:t>
+      </w:r>
+      <w:proofErr w:type="spellEnd"/>
+      <w:r>
+        <w:t xml:space="preserve"> </w:t>
+      </w:r>
+      <w:proofErr w:type="spellStart"/>
+      <w:r>
+        <w:t>dentro</w:t>
+      </w:r>
+      <w:proofErr w:type="spellEnd"/>
+      <w:r>
+        <w:t xml:space="preserve"> del JAR final. </w:t>
+      </w:r>
+      <w:proofErr w:type="spellStart"/>
+      <w:r>
+        <w:t>Eso</w:t>
+      </w:r>
+      <w:proofErr w:type="spellEnd"/>
+      <w:r>
+        <w:t xml:space="preserve"> </w:t>
+      </w:r>
+      <w:proofErr w:type="spellStart"/>
+      <w:r>
+        <w:t>añade</w:t>
+      </w:r>
+      <w:proofErr w:type="spellEnd"/>
+      <w:r>
+        <w:t xml:space="preserve"> peso </w:t>
+      </w:r>
+      <w:proofErr w:type="spellStart"/>
+      <w:r>
+        <w:t>innecesario</w:t>
+      </w:r>
+      <w:proofErr w:type="spellEnd"/>
+      <w:r>
+        <w:t xml:space="preserve"> al </w:t>
+      </w:r>
+      <w:proofErr w:type="spellStart"/>
+      <w:r>
+        <w:t>artefacto</w:t>
+      </w:r>
+      <w:proofErr w:type="spellEnd"/>
+      <w:r>
+        <w:t xml:space="preserve"> y </w:t>
+      </w:r>
+      <w:proofErr w:type="spellStart"/>
+      <w:r>
+        <w:t>mezcla</w:t>
+      </w:r>
+      <w:proofErr w:type="spellEnd"/>
+      <w:r>
+        <w:t xml:space="preserve"> </w:t>
+      </w:r>
+      <w:proofErr w:type="spellStart"/>
+      <w:r>
+        <w:t>código</w:t>
+      </w:r>
+      <w:proofErr w:type="spellEnd"/>
+      <w:r>
+        <w:t xml:space="preserve"> de </w:t>
+      </w:r>
+      <w:proofErr w:type="spellStart"/>
+      <w:r>
+        <w:t>pruebas</w:t>
+      </w:r>
+      <w:proofErr w:type="spellEnd"/>
+      <w:r>
+        <w:t xml:space="preserve"> con </w:t>
+      </w:r>
+      <w:proofErr w:type="spellStart"/>
+      <w:r>
+        <w:t>código</w:t>
+      </w:r>
+      <w:proofErr w:type="spellEnd"/>
+      <w:r>
+        <w:t xml:space="preserve"> </w:t>
+      </w:r>
+      <w:proofErr w:type="spellStart"/>
+      <w:r>
+        <w:t>productivo</w:t>
+      </w:r>
+      <w:proofErr w:type="spellEnd"/>
+      <w:r>
+        <w:t xml:space="preserve">. </w:t>
+      </w:r>
+      <w:proofErr w:type="spellStart"/>
+      <w:r>
+        <w:t>Además</w:t>
+      </w:r>
+      <w:proofErr w:type="spellEnd"/>
+      <w:r>
+        <w:t xml:space="preserve">, </w:t>
+      </w:r>
+      <w:proofErr w:type="spellStart"/>
+      <w:r>
+        <w:t>conceptualmente</w:t>
+      </w:r>
+      <w:proofErr w:type="spellEnd"/>
+      <w:r>
+        <w:t xml:space="preserve"> JUnit no es </w:t>
+      </w:r>
+      <w:proofErr w:type="spellStart"/>
+      <w:r>
+        <w:t>una</w:t>
+      </w:r>
+      <w:proofErr w:type="spellEnd"/>
+      <w:r>
+        <w:t xml:space="preserve"> </w:t>
+      </w:r>
+      <w:proofErr w:type="spellStart"/>
+      <w:r>
+        <w:t>dependencia</w:t>
+      </w:r>
+      <w:proofErr w:type="spellEnd"/>
+      <w:r>
+        <w:t xml:space="preserve"> de la </w:t>
+      </w:r>
+      <w:proofErr w:type="spellStart"/>
+      <w:r>
+        <w:t>aplicación</w:t>
+      </w:r>
+      <w:proofErr w:type="spellEnd"/>
+      <w:r>
+        <w:t xml:space="preserve">, solo se </w:t>
+      </w:r>
+      <w:proofErr w:type="spellStart"/>
+      <w:r>
+        <w:t>necesita</w:t>
+      </w:r>
+      <w:proofErr w:type="spellEnd"/>
+      <w:r>
+        <w:t xml:space="preserve"> para </w:t>
+      </w:r>
+      <w:proofErr w:type="spellStart"/>
+      <w:r>
+        <w:t>ejecutar</w:t>
+      </w:r>
+      <w:proofErr w:type="spellEnd"/>
+      <w:r>
+        <w:t xml:space="preserve"> </w:t>
+      </w:r>
+      <w:proofErr w:type="spellStart"/>
+      <w:r>
+        <w:t>pruebas</w:t>
+      </w:r>
+      <w:proofErr w:type="spellEnd"/>
+      <w:r>
+        <w:t xml:space="preserve">, </w:t>
+      </w:r>
+      <w:proofErr w:type="spellStart"/>
+      <w:r>
+        <w:t>así</w:t>
+      </w:r>
+      <w:proofErr w:type="spellEnd"/>
+      <w:r>
+        <w:t xml:space="preserve"> que lo </w:t>
+      </w:r>
+      <w:proofErr w:type="spellStart"/>
+      <w:r>
+        <w:t>correcto</w:t>
+      </w:r>
+      <w:proofErr w:type="spellEnd"/>
+      <w:r>
+        <w:t xml:space="preserve"> es </w:t>
+      </w:r>
+      <w:proofErr w:type="spellStart"/>
+      <w:r>
+        <w:t>mantener</w:t>
+      </w:r>
+      <w:proofErr w:type="spellEnd"/>
+      <w:r>
+        <w:t xml:space="preserve"> </w:t>
+      </w:r>
+      <w:proofErr w:type="spellStart"/>
+      <w:r>
+        <w:t>el</w:t>
+      </w:r>
+      <w:proofErr w:type="spellEnd"/>
+      <w:r>
+        <w:t xml:space="preserve"> scope test y mover </w:t>
+      </w:r>
+      <w:proofErr w:type="spellStart"/>
+      <w:r>
+        <w:t>el</w:t>
+      </w:r>
+      <w:proofErr w:type="spellEnd"/>
+      <w:r>
+        <w:t xml:space="preserve"> </w:t>
+      </w:r>
+      <w:proofErr w:type="spellStart"/>
+      <w:r>
+        <w:t>archivo</w:t>
+      </w:r>
+      <w:proofErr w:type="spellEnd"/>
+      <w:r>
+        <w:t xml:space="preserve"> de test a </w:t>
+      </w:r>
+      <w:proofErr w:type="spellStart"/>
+      <w:r>
+        <w:t>su</w:t>
+      </w:r>
+      <w:proofErr w:type="spellEnd"/>
+      <w:r>
+        <w:t xml:space="preserve"> </w:t>
+      </w:r>
+      <w:proofErr w:type="spellStart"/>
+      <w:r>
+        <w:t>carpeta</w:t>
+      </w:r>
+      <w:proofErr w:type="spellEnd"/>
+      <w:r>
+        <w:t xml:space="preserve"> </w:t>
+      </w:r>
+      <w:proofErr w:type="spellStart"/>
+      <w:r>
+        <w:t>correspondiente</w:t>
+      </w:r>
+      <w:proofErr w:type="spellEnd"/>
+      <w:r>
+        <w:t>.</w:t>
       </w:r>
     </w:p>
     <w:p>
@@ -758,13 +2106,6 @@
           <w:lang w:val="es-ES"/>
         </w:rPr>
       </w:pPr>
-      <w:r>
-        <w:rPr>
-          <w:color w:val="1A1A1A"/>
-          <w:lang w:val="es-ES"/>
-        </w:rPr>
-        <w:t xml:space="preserve"> </w:t>
-      </w:r>
     </w:p>
     <w:p>
       <w:pPr>
@@ -794,13 +2135,101 @@
           <w:color w:val="1A1A1A"/>
           <w:lang w:val="es-ES"/>
         </w:rPr>
-        <w:t xml:space="preserve">Ejecuta cada comando y revisa target/ después de cada uno (ls target o dir target). </w:t>
-      </w:r>
-      <w:r>
-        <w:rPr>
-          <w:color w:val="1A1A1A"/>
-        </w:rPr>
-        <w:t>Escribe sólo qué apareció o cambió.</w:t>
+        <w:t>Ejecuta cada comando y revisa target/ después de cada uno (</w:t>
+      </w:r>
+      <w:proofErr w:type="spellStart"/>
+      <w:r>
+        <w:rPr>
+          <w:color w:val="1A1A1A"/>
+          <w:lang w:val="es-ES"/>
+        </w:rPr>
+        <w:t>ls</w:t>
+      </w:r>
+      <w:proofErr w:type="spellEnd"/>
+      <w:r>
+        <w:rPr>
+          <w:color w:val="1A1A1A"/>
+          <w:lang w:val="es-ES"/>
+        </w:rPr>
+        <w:t xml:space="preserve"> target o </w:t>
+      </w:r>
+      <w:proofErr w:type="spellStart"/>
+      <w:r>
+        <w:rPr>
+          <w:color w:val="1A1A1A"/>
+          <w:lang w:val="es-ES"/>
+        </w:rPr>
+        <w:t>dir</w:t>
+      </w:r>
+      <w:proofErr w:type="spellEnd"/>
+      <w:r>
+        <w:rPr>
+          <w:color w:val="1A1A1A"/>
+          <w:lang w:val="es-ES"/>
+        </w:rPr>
+        <w:t xml:space="preserve"> target). </w:t>
+      </w:r>
+      <w:r>
+        <w:rPr>
+          <w:color w:val="1A1A1A"/>
+        </w:rPr>
+        <w:t xml:space="preserve">Escribe </w:t>
+      </w:r>
+      <w:proofErr w:type="spellStart"/>
+      <w:r>
+        <w:rPr>
+          <w:color w:val="1A1A1A"/>
+        </w:rPr>
+        <w:t>sólo</w:t>
+      </w:r>
+      <w:proofErr w:type="spellEnd"/>
+      <w:r>
+        <w:rPr>
+          <w:color w:val="1A1A1A"/>
+        </w:rPr>
+        <w:t xml:space="preserve"> </w:t>
+      </w:r>
+      <w:proofErr w:type="spellStart"/>
+      <w:r>
+        <w:rPr>
+          <w:color w:val="1A1A1A"/>
+        </w:rPr>
+        <w:t>qué</w:t>
+      </w:r>
+      <w:proofErr w:type="spellEnd"/>
+      <w:r>
+        <w:rPr>
+          <w:color w:val="1A1A1A"/>
+        </w:rPr>
+        <w:t xml:space="preserve"> </w:t>
+      </w:r>
+      <w:proofErr w:type="spellStart"/>
+      <w:r>
+        <w:rPr>
+          <w:color w:val="1A1A1A"/>
+        </w:rPr>
+        <w:t>apareció</w:t>
+      </w:r>
+      <w:proofErr w:type="spellEnd"/>
+      <w:r>
+        <w:rPr>
+          <w:color w:val="1A1A1A"/>
+        </w:rPr>
+        <w:t xml:space="preserve"> o </w:t>
+      </w:r>
+      <w:proofErr w:type="spellStart"/>
+      <w:r>
+        <w:rPr>
+          <w:color w:val="1A1A1A"/>
+        </w:rPr>
+        <w:t>cambió</w:t>
+      </w:r>
+      <w:proofErr w:type="spellEnd"/>
+      <w:r>
+        <w:rPr>
+          <w:color w:val="1A1A1A"/>
+        </w:rPr>
+        <w:t>.</w:t>
       </w:r>
     </w:p>
     <w:tbl>
@@ -846,6 +2275,7 @@
             </w:tcMar>
           </w:tcPr>
           <w:p>
+            <w:proofErr w:type="spellStart"/>
             <w:r>
               <w:rPr>
                 <w:b/>
@@ -854,9 +2284,9 @@
                 <w:sz w:val="17"/>
                 <w:szCs w:val="17"/>
               </w:rPr>
-              <w:lastRenderedPageBreak/>
               <w:t>Comando</w:t>
             </w:r>
+            <w:proofErr w:type="spellEnd"/>
           </w:p>
         </w:tc>
         <w:tc>
@@ -914,6 +2344,7 @@
             </w:tcMar>
           </w:tcPr>
           <w:p>
+            <w:proofErr w:type="spellStart"/>
             <w:r>
               <w:rPr>
                 <w:rFonts w:ascii="Consolas" w:eastAsia="Consolas" w:hAnsi="Consolas" w:cs="Consolas"/>
@@ -921,7 +2352,17 @@
                 <w:sz w:val="18"/>
                 <w:szCs w:val="18"/>
               </w:rPr>
-              <w:t>mvn -B test</w:t>
+              <w:t>mvn</w:t>
+            </w:r>
+            <w:proofErr w:type="spellEnd"/>
+            <w:r>
+              <w:rPr>
+                <w:rFonts w:ascii="Consolas" w:eastAsia="Consolas" w:hAnsi="Consolas" w:cs="Consolas"/>
+                <w:color w:val="1A1A1A"/>
+                <w:sz w:val="18"/>
+                <w:szCs w:val="18"/>
+              </w:rPr>
+              <w:t xml:space="preserve"> -B test</w:t>
             </w:r>
           </w:p>
         </w:tc>
@@ -942,13 +2383,77 @@
             </w:tcMar>
           </w:tcPr>
           <w:p>
-            <w:r>
-              <w:rPr>
-                <w:color w:val="1A1A1A"/>
-                <w:sz w:val="18"/>
-                <w:szCs w:val="18"/>
-              </w:rPr>
+            <w:proofErr w:type="spellStart"/>
+            <w:r>
+              <w:t>Aparecieron</w:t>
+            </w:r>
+            <w:proofErr w:type="spellEnd"/>
+            <w:r>
+              <w:t xml:space="preserve"> las </w:t>
+            </w:r>
+            <w:proofErr w:type="spellStart"/>
+            <w:r>
+              <w:t>carpetas</w:t>
+            </w:r>
+            <w:proofErr w:type="spellEnd"/>
+            <w:r>
+              <w:t xml:space="preserve"> test-classes/ (con </w:t>
+            </w:r>
+            <w:proofErr w:type="spellStart"/>
+            <w:r>
+              <w:t>DescuentoSmokeTest.class</w:t>
+            </w:r>
+            <w:proofErr w:type="spellEnd"/>
+            <w:r>
               <w:t xml:space="preserve"> </w:t>
+            </w:r>
+            <w:proofErr w:type="spellStart"/>
+            <w:r>
+              <w:t>compilado</w:t>
+            </w:r>
+            <w:proofErr w:type="spellEnd"/>
+            <w:r>
+              <w:t xml:space="preserve">) y surefire-reports/ (con </w:t>
+            </w:r>
+            <w:proofErr w:type="spellStart"/>
+            <w:r>
+              <w:t>los</w:t>
+            </w:r>
+            <w:proofErr w:type="spellEnd"/>
+            <w:r>
+              <w:t xml:space="preserve"> </w:t>
+            </w:r>
+            <w:proofErr w:type="spellStart"/>
+            <w:r>
+              <w:t>reportes</w:t>
+            </w:r>
+            <w:proofErr w:type="spellEnd"/>
+            <w:r>
+              <w:t xml:space="preserve"> de las 3 </w:t>
+            </w:r>
+            <w:proofErr w:type="spellStart"/>
+            <w:r>
+              <w:t>pruebas</w:t>
+            </w:r>
+            <w:proofErr w:type="spellEnd"/>
+            <w:r>
+              <w:t xml:space="preserve"> </w:t>
+            </w:r>
+            <w:proofErr w:type="spellStart"/>
+            <w:r>
+              <w:t>ejecutadas</w:t>
+            </w:r>
+            <w:proofErr w:type="spellEnd"/>
+            <w:r>
+              <w:t xml:space="preserve"> </w:t>
+            </w:r>
+            <w:proofErr w:type="spellStart"/>
+            <w:r>
+              <w:t>exitosamente</w:t>
+            </w:r>
+            <w:proofErr w:type="spellEnd"/>
+            <w:r>
+              <w:t>).</w:t>
             </w:r>
           </w:p>
         </w:tc>
@@ -971,6 +2476,7 @@
             </w:tcMar>
           </w:tcPr>
           <w:p>
+            <w:proofErr w:type="spellStart"/>
             <w:r>
               <w:rPr>
                 <w:rFonts w:ascii="Consolas" w:eastAsia="Consolas" w:hAnsi="Consolas" w:cs="Consolas"/>
@@ -978,7 +2484,17 @@
                 <w:sz w:val="18"/>
                 <w:szCs w:val="18"/>
               </w:rPr>
-              <w:t>mvn -B package</w:t>
+              <w:t>mvn</w:t>
+            </w:r>
+            <w:proofErr w:type="spellEnd"/>
+            <w:r>
+              <w:rPr>
+                <w:rFonts w:ascii="Consolas" w:eastAsia="Consolas" w:hAnsi="Consolas" w:cs="Consolas"/>
+                <w:color w:val="1A1A1A"/>
+                <w:sz w:val="18"/>
+                <w:szCs w:val="18"/>
+              </w:rPr>
+              <w:t xml:space="preserve"> -B package</w:t>
             </w:r>
           </w:p>
         </w:tc>
@@ -1000,12 +2516,55 @@
           </w:tcPr>
           <w:p>
             <w:r>
-              <w:rPr>
-                <w:color w:val="1A1A1A"/>
-                <w:sz w:val="18"/>
-                <w:szCs w:val="18"/>
-              </w:rPr>
+              <w:t xml:space="preserve">Se </w:t>
+            </w:r>
+            <w:proofErr w:type="spellStart"/>
+            <w:r>
+              <w:t>generó</w:t>
+            </w:r>
+            <w:proofErr w:type="spellEnd"/>
+            <w:r>
               <w:t xml:space="preserve"> </w:t>
+            </w:r>
+            <w:proofErr w:type="spellStart"/>
+            <w:r>
+              <w:t>el</w:t>
+            </w:r>
+            <w:proofErr w:type="spellEnd"/>
+            <w:r>
+              <w:t xml:space="preserve"> </w:t>
+            </w:r>
+            <w:proofErr w:type="spellStart"/>
+            <w:r>
+              <w:t>archivo</w:t>
+            </w:r>
+            <w:proofErr w:type="spellEnd"/>
+            <w:r>
+              <w:t xml:space="preserve"> descuento-volumen-1.0.0-SNAPSHOT.jar </w:t>
+            </w:r>
+            <w:proofErr w:type="spellStart"/>
+            <w:r>
+              <w:t>en</w:t>
+            </w:r>
+            <w:proofErr w:type="spellEnd"/>
+            <w:r>
+              <w:t xml:space="preserve"> target/ y la </w:t>
+            </w:r>
+            <w:proofErr w:type="spellStart"/>
+            <w:r>
+              <w:t>carpeta</w:t>
+            </w:r>
+            <w:proofErr w:type="spellEnd"/>
+            <w:r>
+              <w:t xml:space="preserve"> maven-archiver/ con </w:t>
+            </w:r>
+            <w:proofErr w:type="spellStart"/>
+            <w:r>
+              <w:t>pom.properties</w:t>
+            </w:r>
+            <w:proofErr w:type="spellEnd"/>
+            <w:r>
+              <w:t>.</w:t>
             </w:r>
           </w:p>
         </w:tc>
@@ -1028,6 +2587,7 @@
             </w:tcMar>
           </w:tcPr>
           <w:p>
+            <w:proofErr w:type="spellStart"/>
             <w:r>
               <w:rPr>
                 <w:rFonts w:ascii="Consolas" w:eastAsia="Consolas" w:hAnsi="Consolas" w:cs="Consolas"/>
@@ -1035,7 +2595,17 @@
                 <w:sz w:val="18"/>
                 <w:szCs w:val="18"/>
               </w:rPr>
-              <w:t>mvn -B verify</w:t>
+              <w:t>mvn</w:t>
+            </w:r>
+            <w:proofErr w:type="spellEnd"/>
+            <w:r>
+              <w:rPr>
+                <w:rFonts w:ascii="Consolas" w:eastAsia="Consolas" w:hAnsi="Consolas" w:cs="Consolas"/>
+                <w:color w:val="1A1A1A"/>
+                <w:sz w:val="18"/>
+                <w:szCs w:val="18"/>
+              </w:rPr>
+              <w:t xml:space="preserve"> -B verify</w:t>
             </w:r>
           </w:p>
         </w:tc>
@@ -1057,12 +2627,119 @@
           </w:tcPr>
           <w:p>
             <w:r>
-              <w:rPr>
-                <w:color w:val="1A1A1A"/>
-                <w:sz w:val="18"/>
-                <w:szCs w:val="18"/>
-              </w:rPr>
+              <w:t xml:space="preserve">No </w:t>
+            </w:r>
+            <w:proofErr w:type="spellStart"/>
+            <w:r>
+              <w:t>hubo</w:t>
+            </w:r>
+            <w:proofErr w:type="spellEnd"/>
+            <w:r>
               <w:t xml:space="preserve"> </w:t>
+            </w:r>
+            <w:proofErr w:type="spellStart"/>
+            <w:r>
+              <w:t>cambios</w:t>
+            </w:r>
+            <w:proofErr w:type="spellEnd"/>
+            <w:r>
+              <w:t xml:space="preserve"> </w:t>
+            </w:r>
+            <w:proofErr w:type="spellStart"/>
+            <w:r>
+              <w:t>adicionales</w:t>
+            </w:r>
+            <w:proofErr w:type="spellEnd"/>
+            <w:r>
+              <w:t xml:space="preserve"> </w:t>
+            </w:r>
+            <w:proofErr w:type="spellStart"/>
+            <w:r>
+              <w:t>visibles</w:t>
+            </w:r>
+            <w:proofErr w:type="spellEnd"/>
+            <w:r>
+              <w:t xml:space="preserve"> </w:t>
+            </w:r>
+            <w:proofErr w:type="spellStart"/>
+            <w:r>
+              <w:t>en</w:t>
+            </w:r>
+            <w:proofErr w:type="spellEnd"/>
+            <w:r>
+              <w:t xml:space="preserve"> target/. La </w:t>
+            </w:r>
+            <w:proofErr w:type="spellStart"/>
+            <w:r>
+              <w:t>fase</w:t>
+            </w:r>
+            <w:proofErr w:type="spellEnd"/>
+            <w:r>
+              <w:t xml:space="preserve"> verify </w:t>
+            </w:r>
+            <w:proofErr w:type="spellStart"/>
+            <w:r>
+              <w:t>ejecutó</w:t>
+            </w:r>
+            <w:proofErr w:type="spellEnd"/>
+            <w:r>
+              <w:t xml:space="preserve"> las </w:t>
+            </w:r>
+            <w:proofErr w:type="spellStart"/>
+            <w:r>
+              <w:t>mismas</w:t>
+            </w:r>
+            <w:proofErr w:type="spellEnd"/>
+            <w:r>
+              <w:t xml:space="preserve"> </w:t>
+            </w:r>
+            <w:proofErr w:type="spellStart"/>
+            <w:r>
+              <w:t>fases</w:t>
+            </w:r>
+            <w:proofErr w:type="spellEnd"/>
+            <w:r>
+              <w:t xml:space="preserve"> </w:t>
+            </w:r>
+            <w:proofErr w:type="spellStart"/>
+            <w:r>
+              <w:t>anteriores</w:t>
+            </w:r>
+            <w:proofErr w:type="spellEnd"/>
+            <w:r>
+              <w:t xml:space="preserve"> (compile, test, package) y </w:t>
+            </w:r>
+            <w:proofErr w:type="spellStart"/>
+            <w:r>
+              <w:t>confirmó</w:t>
+            </w:r>
+            <w:proofErr w:type="spellEnd"/>
+            <w:r>
+              <w:t xml:space="preserve"> que </w:t>
+            </w:r>
+            <w:proofErr w:type="spellStart"/>
+            <w:r>
+              <w:t>todo</w:t>
+            </w:r>
+            <w:proofErr w:type="spellEnd"/>
+            <w:r>
+              <w:t xml:space="preserve"> </w:t>
+            </w:r>
+            <w:proofErr w:type="spellStart"/>
+            <w:r>
+              <w:t>pasa</w:t>
+            </w:r>
+            <w:proofErr w:type="spellEnd"/>
+            <w:r>
+              <w:t xml:space="preserve"> </w:t>
+            </w:r>
+            <w:proofErr w:type="spellStart"/>
+            <w:r>
+              <w:t>correctamente</w:t>
+            </w:r>
+            <w:proofErr w:type="spellEnd"/>
+            <w:r>
+              <w:t>.</w:t>
             </w:r>
           </w:p>
         </w:tc>
@@ -1085,6 +2762,7 @@
             </w:tcMar>
           </w:tcPr>
           <w:p>
+            <w:proofErr w:type="spellStart"/>
             <w:r>
               <w:rPr>
                 <w:rFonts w:ascii="Consolas" w:eastAsia="Consolas" w:hAnsi="Consolas" w:cs="Consolas"/>
@@ -1092,8 +2770,29 @@
                 <w:sz w:val="18"/>
                 <w:szCs w:val="18"/>
               </w:rPr>
-              <w:t>mvn -B dependency:tree</w:t>
-            </w:r>
+              <w:t>mvn</w:t>
+            </w:r>
+            <w:proofErr w:type="spellEnd"/>
+            <w:r>
+              <w:rPr>
+                <w:rFonts w:ascii="Consolas" w:eastAsia="Consolas" w:hAnsi="Consolas" w:cs="Consolas"/>
+                <w:color w:val="1A1A1A"/>
+                <w:sz w:val="18"/>
+                <w:szCs w:val="18"/>
+              </w:rPr>
+              <w:t xml:space="preserve"> -B </w:t>
+            </w:r>
+            <w:proofErr w:type="spellStart"/>
+            <w:r>
+              <w:rPr>
+                <w:rFonts w:ascii="Consolas" w:eastAsia="Consolas" w:hAnsi="Consolas" w:cs="Consolas"/>
+                <w:color w:val="1A1A1A"/>
+                <w:sz w:val="18"/>
+                <w:szCs w:val="18"/>
+              </w:rPr>
+              <w:t>dependency:tree</w:t>
+            </w:r>
+            <w:proofErr w:type="spellEnd"/>
           </w:p>
         </w:tc>
         <w:tc>
@@ -1114,12 +2813,111 @@
           </w:tcPr>
           <w:p>
             <w:r>
-              <w:rPr>
-                <w:color w:val="1A1A1A"/>
-                <w:sz w:val="18"/>
-                <w:szCs w:val="18"/>
-              </w:rPr>
+              <w:t xml:space="preserve">No se </w:t>
+            </w:r>
+            <w:proofErr w:type="spellStart"/>
+            <w:r>
+              <w:t>generó</w:t>
+            </w:r>
+            <w:proofErr w:type="spellEnd"/>
+            <w:r>
+              <w:t xml:space="preserve"> nada nuevo </w:t>
+            </w:r>
+            <w:proofErr w:type="spellStart"/>
+            <w:r>
+              <w:t>en</w:t>
+            </w:r>
+            <w:proofErr w:type="spellEnd"/>
+            <w:r>
+              <w:t xml:space="preserve"> target/. El </w:t>
+            </w:r>
+            <w:proofErr w:type="spellStart"/>
+            <w:r>
+              <w:t>comando</w:t>
+            </w:r>
+            <w:proofErr w:type="spellEnd"/>
+            <w:r>
+              <w:t xml:space="preserve"> solo </w:t>
+            </w:r>
+            <w:proofErr w:type="spellStart"/>
+            <w:r>
+              <w:t>imprimió</w:t>
+            </w:r>
+            <w:proofErr w:type="spellEnd"/>
+            <w:r>
               <w:t xml:space="preserve"> </w:t>
+            </w:r>
+            <w:proofErr w:type="spellStart"/>
+            <w:r>
+              <w:t>en</w:t>
+            </w:r>
+            <w:proofErr w:type="spellEnd"/>
+            <w:r>
+              <w:t xml:space="preserve"> </w:t>
+            </w:r>
+            <w:proofErr w:type="spellStart"/>
+            <w:r>
+              <w:t>consola</w:t>
+            </w:r>
+            <w:proofErr w:type="spellEnd"/>
+            <w:r>
+              <w:t xml:space="preserve"> </w:t>
+            </w:r>
+            <w:proofErr w:type="spellStart"/>
+            <w:r>
+              <w:t>el</w:t>
+            </w:r>
+            <w:proofErr w:type="spellEnd"/>
+            <w:r>
+              <w:t xml:space="preserve"> árbol de </w:t>
+            </w:r>
+            <w:proofErr w:type="spellStart"/>
+            <w:r>
+              <w:t>dependencias</w:t>
+            </w:r>
+            <w:proofErr w:type="spellEnd"/>
+            <w:r>
+              <w:t xml:space="preserve"> del </w:t>
+            </w:r>
+            <w:proofErr w:type="spellStart"/>
+            <w:r>
+              <w:t>proyecto</w:t>
+            </w:r>
+            <w:proofErr w:type="spellEnd"/>
+            <w:r>
+              <w:t xml:space="preserve">, </w:t>
+            </w:r>
+            <w:proofErr w:type="spellStart"/>
+            <w:r>
+              <w:t>mostrando</w:t>
+            </w:r>
+            <w:proofErr w:type="spellEnd"/>
+            <w:r>
+              <w:t xml:space="preserve"> </w:t>
+            </w:r>
+            <w:proofErr w:type="spellStart"/>
+            <w:r>
+              <w:t>junit-jupiter</w:t>
+            </w:r>
+            <w:proofErr w:type="spellEnd"/>
+            <w:r>
+              <w:t xml:space="preserve"> y sus </w:t>
+            </w:r>
+            <w:proofErr w:type="spellStart"/>
+            <w:r>
+              <w:t>transitivas</w:t>
+            </w:r>
+            <w:proofErr w:type="spellEnd"/>
+            <w:r>
+              <w:t xml:space="preserve">, </w:t>
+            </w:r>
+            <w:proofErr w:type="spellStart"/>
+            <w:r>
+              <w:t>todas</w:t>
+            </w:r>
+            <w:proofErr w:type="spellEnd"/>
+            <w:r>
+              <w:t xml:space="preserve"> con scope test.</w:t>
             </w:r>
           </w:p>
         </w:tc>
@@ -1137,7 +2935,23 @@
           <w:color w:val="1A1A1A"/>
           <w:lang w:val="es-ES"/>
         </w:rPr>
-        <w:t>Después abre el JAR y comprueba que JUnit no viaja dentro:</w:t>
+        <w:t xml:space="preserve">Después abre el JAR y comprueba que </w:t>
+      </w:r>
+      <w:proofErr w:type="spellStart"/>
+      <w:r>
+        <w:rPr>
+          <w:color w:val="1A1A1A"/>
+          <w:lang w:val="es-ES"/>
+        </w:rPr>
+        <w:t>JUnit</w:t>
+      </w:r>
+      <w:proofErr w:type="spellEnd"/>
+      <w:r>
+        <w:rPr>
+          <w:color w:val="1A1A1A"/>
+          <w:lang w:val="es-ES"/>
+        </w:rPr>
+        <w:t xml:space="preserve"> no viaja dentro:</w:t>
       </w:r>
     </w:p>
     <w:tbl>
@@ -1186,7 +3000,27 @@
                 <w:sz w:val="17"/>
                 <w:szCs w:val="17"/>
               </w:rPr>
-              <w:t>jar -tf target/descuento-volumen-1.0.0-SNAPSHOT.jar</w:t>
+              <w:t>jar -</w:t>
+            </w:r>
+            <w:proofErr w:type="spellStart"/>
+            <w:r>
+              <w:rPr>
+                <w:rFonts w:ascii="Consolas" w:eastAsia="Consolas" w:hAnsi="Consolas" w:cs="Consolas"/>
+                <w:color w:val="1A1A1A"/>
+                <w:sz w:val="17"/>
+                <w:szCs w:val="17"/>
+              </w:rPr>
+              <w:t>tf</w:t>
+            </w:r>
+            <w:proofErr w:type="spellEnd"/>
+            <w:r>
+              <w:rPr>
+                <w:rFonts w:ascii="Consolas" w:eastAsia="Consolas" w:hAnsi="Consolas" w:cs="Consolas"/>
+                <w:color w:val="1A1A1A"/>
+                <w:sz w:val="17"/>
+                <w:szCs w:val="17"/>
+              </w:rPr>
+              <w:t xml:space="preserve"> target/descuento-volumen-1.0.0-SNAPSHOT.jar</w:t>
             </w:r>
           </w:p>
         </w:tc>
@@ -1227,11 +3061,303 @@
         </w:rPr>
       </w:pPr>
       <w:r>
-        <w:rPr>
-          <w:color w:val="1A1A1A"/>
-          <w:lang w:val="es-ES"/>
-        </w:rPr>
-        <w:t xml:space="preserve"> </w:t>
+        <w:t xml:space="preserve">La </w:t>
+      </w:r>
+      <w:proofErr w:type="spellStart"/>
+      <w:r>
+        <w:t>única</w:t>
+      </w:r>
+      <w:proofErr w:type="spellEnd"/>
+      <w:r>
+        <w:t xml:space="preserve"> </w:t>
+      </w:r>
+      <w:proofErr w:type="spellStart"/>
+      <w:r>
+        <w:t>dependencia</w:t>
+      </w:r>
+      <w:proofErr w:type="spellEnd"/>
+      <w:r>
+        <w:t xml:space="preserve"> que </w:t>
+      </w:r>
+      <w:proofErr w:type="spellStart"/>
+      <w:r>
+        <w:t>declaré</w:t>
+      </w:r>
+      <w:proofErr w:type="spellEnd"/>
+      <w:r>
+        <w:t xml:space="preserve"> </w:t>
+      </w:r>
+      <w:proofErr w:type="spellStart"/>
+      <w:r>
+        <w:t>en</w:t>
+      </w:r>
+      <w:proofErr w:type="spellEnd"/>
+      <w:r>
+        <w:t xml:space="preserve"> </w:t>
+      </w:r>
+      <w:proofErr w:type="spellStart"/>
+      <w:r>
+        <w:t>el</w:t>
+      </w:r>
+      <w:proofErr w:type="spellEnd"/>
+      <w:r>
+        <w:t xml:space="preserve"> pom.xml </w:t>
+      </w:r>
+      <w:proofErr w:type="spellStart"/>
+      <w:r>
+        <w:t>fue</w:t>
+      </w:r>
+      <w:proofErr w:type="spellEnd"/>
+      <w:r>
+        <w:t xml:space="preserve"> </w:t>
+      </w:r>
+      <w:proofErr w:type="spellStart"/>
+      <w:r>
+        <w:t>org.junit.jupiter:junit-jupiter</w:t>
+      </w:r>
+      <w:proofErr w:type="spellEnd"/>
+      <w:r>
+        <w:t xml:space="preserve">. Las </w:t>
+      </w:r>
+      <w:proofErr w:type="spellStart"/>
+      <w:r>
+        <w:t>demás</w:t>
+      </w:r>
+      <w:proofErr w:type="spellEnd"/>
+      <w:r>
+        <w:t xml:space="preserve"> </w:t>
+      </w:r>
+      <w:proofErr w:type="spellStart"/>
+      <w:r>
+        <w:t>llegaron</w:t>
+      </w:r>
+      <w:proofErr w:type="spellEnd"/>
+      <w:r>
+        <w:t xml:space="preserve"> </w:t>
+      </w:r>
+      <w:proofErr w:type="spellStart"/>
+      <w:r>
+        <w:t>solas</w:t>
+      </w:r>
+      <w:proofErr w:type="spellEnd"/>
+      <w:r>
+        <w:t xml:space="preserve"> </w:t>
+      </w:r>
+      <w:proofErr w:type="spellStart"/>
+      <w:r>
+        <w:t>como</w:t>
+      </w:r>
+      <w:proofErr w:type="spellEnd"/>
+      <w:r>
+        <w:t xml:space="preserve"> </w:t>
+      </w:r>
+      <w:proofErr w:type="spellStart"/>
+      <w:r>
+        <w:t>dependencias</w:t>
+      </w:r>
+      <w:proofErr w:type="spellEnd"/>
+      <w:r>
+        <w:t xml:space="preserve"> </w:t>
+      </w:r>
+      <w:proofErr w:type="spellStart"/>
+      <w:r>
+        <w:t>transitivas</w:t>
+      </w:r>
+      <w:proofErr w:type="spellEnd"/>
+      <w:r>
+        <w:t xml:space="preserve">: </w:t>
+      </w:r>
+      <w:proofErr w:type="spellStart"/>
+      <w:r>
+        <w:t>junit-jupiter-api</w:t>
+      </w:r>
+      <w:proofErr w:type="spellEnd"/>
+      <w:r>
+        <w:t xml:space="preserve">, </w:t>
+      </w:r>
+      <w:proofErr w:type="spellStart"/>
+      <w:r>
+        <w:t>junit</w:t>
+      </w:r>
+      <w:proofErr w:type="spellEnd"/>
+      <w:r>
+        <w:t>-</w:t>
+      </w:r>
+      <w:proofErr w:type="spellStart"/>
+      <w:r>
+        <w:t>jupiter</w:t>
+      </w:r>
+      <w:proofErr w:type="spellEnd"/>
+      <w:r>
+        <w:t xml:space="preserve">-params, </w:t>
+      </w:r>
+      <w:proofErr w:type="spellStart"/>
+      <w:r>
+        <w:t>junit</w:t>
+      </w:r>
+      <w:proofErr w:type="spellEnd"/>
+      <w:r>
+        <w:t>-</w:t>
+      </w:r>
+      <w:proofErr w:type="spellStart"/>
+      <w:r>
+        <w:t>jupiter</w:t>
+      </w:r>
+      <w:proofErr w:type="spellEnd"/>
+      <w:r>
+        <w:t xml:space="preserve">-engine, </w:t>
+      </w:r>
+      <w:proofErr w:type="spellStart"/>
+      <w:r>
+        <w:t>junit</w:t>
+      </w:r>
+      <w:proofErr w:type="spellEnd"/>
+      <w:r>
+        <w:t xml:space="preserve">-platform-commons, </w:t>
+      </w:r>
+      <w:proofErr w:type="spellStart"/>
+      <w:r>
+        <w:t>junit</w:t>
+      </w:r>
+      <w:proofErr w:type="spellEnd"/>
+      <w:r>
+        <w:t xml:space="preserve">-platform-engine, opentest4j y </w:t>
+      </w:r>
+      <w:proofErr w:type="spellStart"/>
+      <w:r>
+        <w:t>apiguardian-api</w:t>
+      </w:r>
+      <w:proofErr w:type="spellEnd"/>
+      <w:r>
+        <w:t xml:space="preserve">. </w:t>
+      </w:r>
+      <w:proofErr w:type="spellStart"/>
+      <w:r>
+        <w:t>Ninguna</w:t>
+      </w:r>
+      <w:proofErr w:type="spellEnd"/>
+      <w:r>
+        <w:t xml:space="preserve"> de </w:t>
+      </w:r>
+      <w:proofErr w:type="spellStart"/>
+      <w:r>
+        <w:t>ellas</w:t>
+      </w:r>
+      <w:proofErr w:type="spellEnd"/>
+      <w:r>
+        <w:t xml:space="preserve"> </w:t>
+      </w:r>
+      <w:proofErr w:type="spellStart"/>
+      <w:r>
+        <w:t>entra</w:t>
+      </w:r>
+      <w:proofErr w:type="spellEnd"/>
+      <w:r>
+        <w:t xml:space="preserve"> al JAR </w:t>
+      </w:r>
+      <w:proofErr w:type="spellStart"/>
+      <w:r>
+        <w:t>porque</w:t>
+      </w:r>
+      <w:proofErr w:type="spellEnd"/>
+      <w:r>
+        <w:t xml:space="preserve"> </w:t>
+      </w:r>
+      <w:proofErr w:type="spellStart"/>
+      <w:r>
+        <w:t>todas</w:t>
+      </w:r>
+      <w:proofErr w:type="spellEnd"/>
+      <w:r>
+        <w:t xml:space="preserve"> </w:t>
+      </w:r>
+      <w:proofErr w:type="spellStart"/>
+      <w:r>
+        <w:t>tienen</w:t>
+      </w:r>
+      <w:proofErr w:type="spellEnd"/>
+      <w:r>
+        <w:t xml:space="preserve"> scope test, lo que </w:t>
+      </w:r>
+      <w:proofErr w:type="spellStart"/>
+      <w:r>
+        <w:t>significa</w:t>
+      </w:r>
+      <w:proofErr w:type="spellEnd"/>
+      <w:r>
+        <w:t xml:space="preserve"> que Maven solo las </w:t>
+      </w:r>
+      <w:proofErr w:type="spellStart"/>
+      <w:r>
+        <w:t>usa</w:t>
+      </w:r>
+      <w:proofErr w:type="spellEnd"/>
+      <w:r>
+        <w:t xml:space="preserve"> para </w:t>
+      </w:r>
+      <w:proofErr w:type="spellStart"/>
+      <w:r>
+        <w:t>compilar</w:t>
+      </w:r>
+      <w:proofErr w:type="spellEnd"/>
+      <w:r>
+        <w:t xml:space="preserve"> y </w:t>
+      </w:r>
+      <w:proofErr w:type="spellStart"/>
+      <w:r>
+        <w:t>ejecutar</w:t>
+      </w:r>
+      <w:proofErr w:type="spellEnd"/>
+      <w:r>
+        <w:t xml:space="preserve"> las </w:t>
+      </w:r>
+      <w:proofErr w:type="spellStart"/>
+      <w:r>
+        <w:t>pruebas</w:t>
+      </w:r>
+      <w:proofErr w:type="spellEnd"/>
+      <w:r>
+        <w:t xml:space="preserve">, </w:t>
+      </w:r>
+      <w:proofErr w:type="spellStart"/>
+      <w:r>
+        <w:t>pero</w:t>
+      </w:r>
+      <w:proofErr w:type="spellEnd"/>
+      <w:r>
+        <w:t xml:space="preserve"> no las </w:t>
+      </w:r>
+      <w:proofErr w:type="spellStart"/>
+      <w:r>
+        <w:t>empaqueta</w:t>
+      </w:r>
+      <w:proofErr w:type="spellEnd"/>
+      <w:r>
+        <w:t xml:space="preserve"> </w:t>
+      </w:r>
+      <w:proofErr w:type="spellStart"/>
+      <w:r>
+        <w:t>en</w:t>
+      </w:r>
+      <w:proofErr w:type="spellEnd"/>
+      <w:r>
+        <w:t xml:space="preserve"> </w:t>
+      </w:r>
+      <w:proofErr w:type="spellStart"/>
+      <w:r>
+        <w:t>el</w:t>
+      </w:r>
+      <w:proofErr w:type="spellEnd"/>
+      <w:r>
+        <w:t xml:space="preserve"> </w:t>
+      </w:r>
+      <w:proofErr w:type="spellStart"/>
+      <w:r>
+        <w:t>artefacto</w:t>
+      </w:r>
+      <w:proofErr w:type="spellEnd"/>
+      <w:r>
+        <w:t xml:space="preserve"> final.</w:t>
       </w:r>
     </w:p>
     <w:p>
@@ -1244,13 +3370,6 @@
           <w:lang w:val="es-ES"/>
         </w:rPr>
       </w:pPr>
-      <w:r>
-        <w:rPr>
-          <w:color w:val="1A1A1A"/>
-          <w:lang w:val="es-ES"/>
-        </w:rPr>
-        <w:t xml:space="preserve"> </w:t>
-      </w:r>
     </w:p>
     <w:p>
       <w:pPr>
@@ -1293,7 +3412,23 @@
           <w:color w:val="1A1A1A"/>
           <w:lang w:val="es-ES"/>
         </w:rPr>
-        <w:t>El build termina en BUILD SUCCESS con 3 pruebas ejecutadas y el JAR generado en target/.</w:t>
+        <w:t xml:space="preserve">El </w:t>
+      </w:r>
+      <w:proofErr w:type="spellStart"/>
+      <w:r>
+        <w:rPr>
+          <w:color w:val="1A1A1A"/>
+          <w:lang w:val="es-ES"/>
+        </w:rPr>
+        <w:t>build</w:t>
+      </w:r>
+      <w:proofErr w:type="spellEnd"/>
+      <w:r>
+        <w:rPr>
+          <w:color w:val="1A1A1A"/>
+          <w:lang w:val="es-ES"/>
+        </w:rPr>
+        <w:t xml:space="preserve"> termina en BUILD SUCCESS con 3 pruebas ejecutadas y el JAR generado en target/.</w:t>
       </w:r>
     </w:p>
     <w:p>
@@ -1343,7 +3478,23 @@
           <w:color w:val="1A1A1A"/>
           <w:lang w:val="es-ES"/>
         </w:rPr>
-        <w:t>Hay un commit con el proyecto roto y otro con la corrección.</w:t>
+        <w:t xml:space="preserve">Hay un </w:t>
+      </w:r>
+      <w:proofErr w:type="spellStart"/>
+      <w:r>
+        <w:rPr>
+          <w:color w:val="1A1A1A"/>
+          <w:lang w:val="es-ES"/>
+        </w:rPr>
+        <w:t>commit</w:t>
+      </w:r>
+      <w:proofErr w:type="spellEnd"/>
+      <w:r>
+        <w:rPr>
+          <w:color w:val="1A1A1A"/>
+          <w:lang w:val="es-ES"/>
+        </w:rPr>
+        <w:t xml:space="preserve"> con el proyecto roto y otro con la corrección.</w:t>
       </w:r>
     </w:p>
     <w:p>
@@ -1389,7 +3540,7 @@
 </file>
 
 <file path=word/numbering.xml><?xml version="1.0" encoding="utf-8"?>
-<w:numbering xmlns:wpc="http://schemas.microsoft.com/office/word/2010/wordprocessingCanvas" xmlns:cx="http://schemas.microsoft.com/office/drawing/2014/chartex" xmlns:cx1="http://schemas.microsoft.com/office/drawing/2015/9/8/chartex" xmlns:cx2="http://schemas.microsoft.com/office/drawing/2015/10/21/chartex" xmlns:cx3="http://schemas.microsoft.com/office/drawing/2016/5/9/chartex" xmlns:cx4="http://schemas.microsoft.com/office/drawing/2016/5/10/chartex" xmlns:cx5="http://schemas.microsoft.com/office/drawing/2016/5/11/chartex" xmlns:cx6="http://schemas.microsoft.com/office/drawing/2016/5/12/chartex" xmlns:cx7="http://schemas.microsoft.com/office/drawing/2016/5/13/chartex" xmlns:cx8="http://schemas.microsoft.com/office/drawing/2016/5/14/chartex" xmlns:mc="http://schemas.openxmlformats.org/markup-compatibility/2006" xmlns:aink="http://schemas.microsoft.com/office/drawing/2016/ink" xmlns:am3d="http://schemas.microsoft.com/office/drawing/2017/model3d" xmlns:o="urn:schemas-microsoft-com:office:office" xmlns:oel="http://schemas.microsoft.com/office/2019/extlst" xmlns:r="http://schemas.openxmlformats.org/officeDocument/2006/relationships" xmlns:m="http://schemas.openxmlformats.org/officeDocument/2006/math" xmlns:v="urn:schemas-microsoft-com:vml" xmlns:wp14="http://schemas.microsoft.com/office/word/2010/wordprocessingDrawing" xmlns:wp="http://schemas.openxmlformats.org/drawingml/2006/wordprocessingDrawing" xmlns:w10="urn:schemas-microsoft-com:office:word" xmlns:w="http://schemas.openxmlformats.org/wordprocessingml/2006/main" xmlns:w14="http://schemas.microsoft.com/office/word/2010/wordml" xmlns:w15="http://schemas.microsoft.com/office/word/2012/wordml" xmlns:w16cex="http://schemas.microsoft.com/office/word/2018/wordml/cex" xmlns:w16cid="http://schemas.microsoft.com/office/word/2016/wordml/cid" xmlns:w16="http://schemas.microsoft.com/office/word/2018/wordml" xmlns:w16du="http://schemas.microsoft.com/office/word/2023/wordml/word16du" xmlns:w16sdtdh="http://schemas.microsoft.com/office/word/2020/wordml/sdtdatahash" xmlns:w16sdtfl="http://schemas.microsoft.com/office/word/2024/wordml/sdtformatlock" xmlns:w16se="http://schemas.microsoft.com/office/word/2015/wordml/symex" xmlns:wpg="http://schemas.microsoft.com/office/word/2010/wordprocessingGroup" xmlns:wpi="http://schemas.microsoft.com/office/word/2010/wordprocessingInk" xmlns:wne="http://schemas.microsoft.com/office/word/2006/wordml" xmlns:wps="http://schemas.microsoft.com/office/word/2010/wordprocessingShape" mc:Ignorable="w14 w15 w16se w16cid w16 w16cex w16sdtdh w16sdtfl w16du wp14">
+<w:numbering xmlns:wpc="http://schemas.microsoft.com/office/word/2010/wordprocessingCanvas" xmlns:cx="http://schemas.microsoft.com/office/drawing/2014/chartex" xmlns:cx1="http://schemas.microsoft.com/office/drawing/2015/9/8/chartex" xmlns:cx2="http://schemas.microsoft.com/office/drawing/2015/10/21/chartex" xmlns:cx3="http://schemas.microsoft.com/office/drawing/2016/5/9/chartex" xmlns:cx4="http://schemas.microsoft.com/office/drawing/2016/5/10/chartex" xmlns:cx5="http://schemas.microsoft.com/office/drawing/2016/5/11/chartex" xmlns:cx6="http://schemas.microsoft.com/office/drawing/2016/5/12/chartex" xmlns:cx7="http://schemas.microsoft.com/office/drawing/2016/5/13/chartex" xmlns:cx8="http://schemas.microsoft.com/office/drawing/2016/5/14/chartex" xmlns:mc="http://schemas.openxmlformats.org/markup-compatibility/2006" xmlns:aink="http://schemas.microsoft.com/office/drawing/2016/ink" xmlns:am3d="http://schemas.microsoft.com/office/drawing/2017/model3d" xmlns:o="urn:schemas-microsoft-com:office:office" xmlns:oel="http://schemas.microsoft.com/office/2019/extlst" xmlns:r="http://schemas.openxmlformats.org/officeDocument/2006/relationships" xmlns:m="http://schemas.openxmlformats.org/officeDocument/2006/math" xmlns:v="urn:schemas-microsoft-com:vml" xmlns:wp14="http://schemas.microsoft.com/office/word/2010/wordprocessingDrawing" xmlns:wp="http://schemas.openxmlformats.org/drawingml/2006/wordprocessingDrawing" xmlns:w10="urn:schemas-microsoft-com:office:word" xmlns:w="http://schemas.openxmlformats.org/wordprocessingml/2006/main" xmlns:w14="http://schemas.microsoft.com/office/word/2010/wordml" xmlns:w15="http://schemas.microsoft.com/office/word/2012/wordml" xmlns:w16cex="http://schemas.microsoft.com/office/word/2018/wordml/cex" xmlns:w16cid="http://schemas.microsoft.com/office/word/2016/wordml/cid" xmlns:w16="http://schemas.microsoft.com/office/word/2018/wordml" xmlns:w16sdtdh="http://schemas.microsoft.com/office/word/2020/wordml/sdtdatahash" xmlns:w16se="http://schemas.microsoft.com/office/word/2015/wordml/symex" xmlns:wpg="http://schemas.microsoft.com/office/word/2010/wordprocessingGroup" xmlns:wpi="http://schemas.microsoft.com/office/word/2010/wordprocessingInk" xmlns:wne="http://schemas.microsoft.com/office/word/2006/wordml" xmlns:wps="http://schemas.microsoft.com/office/word/2010/wordprocessingShape" mc:Ignorable="w14 w15 w16se w16cid w16 w16cex w16sdtdh wp14">
   <w:abstractNum w:abstractNumId="0" w15:restartNumberingAfterBreak="0">
     <w:nsid w:val="1ED204B2"/>
     <w:multiLevelType w:val="hybridMultilevel"/>
@@ -1486,7 +3637,7 @@
 </file>
 
 <file path=word/styles.xml><?xml version="1.0" encoding="utf-8"?>
-<w:styles xmlns:mc="http://schemas.openxmlformats.org/markup-compatibility/2006" xmlns:r="http://schemas.openxmlformats.org/officeDocument/2006/relationships" xmlns:w="http://schemas.openxmlformats.org/wordprocessingml/2006/main" xmlns:w14="http://schemas.microsoft.com/office/word/2010/wordml" xmlns:w15="http://schemas.microsoft.com/office/word/2012/wordml" xmlns:w16cex="http://schemas.microsoft.com/office/word/2018/wordml/cex" xmlns:w16cid="http://schemas.microsoft.com/office/word/2016/wordml/cid" xmlns:w16="http://schemas.microsoft.com/office/word/2018/wordml" xmlns:w16du="http://schemas.microsoft.com/office/word/2023/wordml/word16du" xmlns:w16sdtdh="http://schemas.microsoft.com/office/word/2020/wordml/sdtdatahash" xmlns:w16sdtfl="http://schemas.microsoft.com/office/word/2024/wordml/sdtformatlock" xmlns:w16se="http://schemas.microsoft.com/office/word/2015/wordml/symex" mc:Ignorable="w14 w15 w16se w16cid w16 w16cex w16sdtdh w16sdtfl w16du">
+<w:styles xmlns:mc="http://schemas.openxmlformats.org/markup-compatibility/2006" xmlns:r="http://schemas.openxmlformats.org/officeDocument/2006/relationships" xmlns:w="http://schemas.openxmlformats.org/wordprocessingml/2006/main" xmlns:w14="http://schemas.microsoft.com/office/word/2010/wordml" xmlns:w15="http://schemas.microsoft.com/office/word/2012/wordml" xmlns:w16cex="http://schemas.microsoft.com/office/word/2018/wordml/cex" xmlns:w16cid="http://schemas.microsoft.com/office/word/2016/wordml/cid" xmlns:w16="http://schemas.microsoft.com/office/word/2018/wordml" xmlns:w16sdtdh="http://schemas.microsoft.com/office/word/2020/wordml/sdtdatahash" xmlns:w16se="http://schemas.microsoft.com/office/word/2015/wordml/symex" mc:Ignorable="w14 w15 w16se w16cid w16 w16cex w16sdtdh">
   <w:docDefaults>
     <w:rPrDefault>
       <w:rPr>
@@ -1878,7 +4029,7 @@
     <w:name w:val="Normal"/>
     <w:qFormat/>
   </w:style>
-  <w:style w:type="paragraph" w:styleId="Heading1">
+  <w:style w:type="paragraph" w:styleId="Ttulo1">
     <w:name w:val="heading 1"/>
     <w:uiPriority w:val="9"/>
     <w:qFormat/>
@@ -1891,7 +4042,7 @@
       <w:szCs w:val="32"/>
     </w:rPr>
   </w:style>
-  <w:style w:type="paragraph" w:styleId="Heading2">
+  <w:style w:type="paragraph" w:styleId="Ttulo2">
     <w:name w:val="heading 2"/>
     <w:uiPriority w:val="9"/>
     <w:semiHidden/>
@@ -1906,7 +4057,7 @@
       <w:szCs w:val="26"/>
     </w:rPr>
   </w:style>
-  <w:style w:type="paragraph" w:styleId="Heading3">
+  <w:style w:type="paragraph" w:styleId="Ttulo3">
     <w:name w:val="heading 3"/>
     <w:uiPriority w:val="9"/>
     <w:semiHidden/>
@@ -1921,7 +4072,7 @@
       <w:szCs w:val="24"/>
     </w:rPr>
   </w:style>
-  <w:style w:type="paragraph" w:styleId="Heading4">
+  <w:style w:type="paragraph" w:styleId="Ttulo4">
     <w:name w:val="heading 4"/>
     <w:uiPriority w:val="9"/>
     <w:semiHidden/>
@@ -1936,7 +4087,7 @@
       <w:color w:val="2E74B5"/>
     </w:rPr>
   </w:style>
-  <w:style w:type="paragraph" w:styleId="Heading5">
+  <w:style w:type="paragraph" w:styleId="Ttulo5">
     <w:name w:val="heading 5"/>
     <w:uiPriority w:val="9"/>
     <w:semiHidden/>
@@ -1949,7 +4100,7 @@
       <w:color w:val="2E74B5"/>
     </w:rPr>
   </w:style>
-  <w:style w:type="paragraph" w:styleId="Heading6">
+  <w:style w:type="paragraph" w:styleId="Ttulo6">
     <w:name w:val="heading 6"/>
     <w:uiPriority w:val="9"/>
     <w:semiHidden/>
@@ -1962,13 +4113,13 @@
       <w:color w:val="1F4D78"/>
     </w:rPr>
   </w:style>
-  <w:style w:type="character" w:default="1" w:styleId="DefaultParagraphFont">
+  <w:style w:type="character" w:default="1" w:styleId="Fuentedeprrafopredeter">
     <w:name w:val="Default Paragraph Font"/>
     <w:uiPriority w:val="1"/>
     <w:semiHidden/>
     <w:unhideWhenUsed/>
   </w:style>
-  <w:style w:type="table" w:default="1" w:styleId="TableNormal">
+  <w:style w:type="table" w:default="1" w:styleId="Tablanormal">
     <w:name w:val="Normal Table"/>
     <w:uiPriority w:val="99"/>
     <w:semiHidden/>
@@ -1983,13 +4134,13 @@
       </w:tblCellMar>
     </w:tblPr>
   </w:style>
-  <w:style w:type="numbering" w:default="1" w:styleId="NoList">
+  <w:style w:type="numbering" w:default="1" w:styleId="Sinlista">
     <w:name w:val="No List"/>
     <w:uiPriority w:val="99"/>
     <w:semiHidden/>
     <w:unhideWhenUsed/>
   </w:style>
-  <w:style w:type="paragraph" w:styleId="Title">
+  <w:style w:type="paragraph" w:styleId="Ttulo">
     <w:name w:val="Title"/>
     <w:uiPriority w:val="10"/>
     <w:qFormat/>
@@ -2006,11 +4157,11 @@
       <w:bCs/>
     </w:rPr>
   </w:style>
-  <w:style w:type="paragraph" w:styleId="ListParagraph">
+  <w:style w:type="paragraph" w:styleId="Prrafodelista">
     <w:name w:val="List Paragraph"/>
     <w:qFormat/>
   </w:style>
-  <w:style w:type="character" w:styleId="Hyperlink">
+  <w:style w:type="character" w:styleId="Hipervnculo">
     <w:name w:val="Hyperlink"/>
     <w:uiPriority w:val="99"/>
     <w:unhideWhenUsed/>
@@ -2019,7 +4170,7 @@
       <w:u w:val="single"/>
     </w:rPr>
   </w:style>
-  <w:style w:type="character" w:styleId="FootnoteReference">
+  <w:style w:type="character" w:styleId="Refdenotaalpie">
     <w:name w:val="footnote reference"/>
     <w:uiPriority w:val="99"/>
     <w:semiHidden/>
@@ -2028,16 +4179,16 @@
       <w:vertAlign w:val="superscript"/>
     </w:rPr>
   </w:style>
-  <w:style w:type="paragraph" w:styleId="FootnoteText">
+  <w:style w:type="paragraph" w:styleId="Textonotapie">
     <w:name w:val="footnote text"/>
-    <w:link w:val="FootnoteTextChar"/>
+    <w:link w:val="TextonotapieCar"/>
     <w:uiPriority w:val="99"/>
     <w:semiHidden/>
     <w:unhideWhenUsed/>
   </w:style>
-  <w:style w:type="character" w:customStyle="1" w:styleId="FootnoteTextChar">
-    <w:name w:val="Footnote Text Char"/>
-    <w:link w:val="FootnoteText"/>
+  <w:style w:type="character" w:customStyle="1" w:styleId="TextonotapieCar">
+    <w:name w:val="Texto nota pie Car"/>
+    <w:link w:val="Textonotapie"/>
     <w:uiPriority w:val="99"/>
     <w:semiHidden/>
     <w:unhideWhenUsed/>
@@ -2046,7 +4197,7 @@
       <w:szCs w:val="20"/>
     </w:rPr>
   </w:style>
-  <w:style w:type="character" w:styleId="EndnoteReference">
+  <w:style w:type="character" w:styleId="Refdenotaalfinal">
     <w:name w:val="endnote reference"/>
     <w:uiPriority w:val="99"/>
     <w:semiHidden/>
@@ -2055,16 +4206,16 @@
       <w:vertAlign w:val="superscript"/>
     </w:rPr>
   </w:style>
-  <w:style w:type="paragraph" w:styleId="EndnoteText">
+  <w:style w:type="paragraph" w:styleId="Textonotaalfinal">
     <w:name w:val="endnote text"/>
-    <w:link w:val="EndnoteTextChar"/>
+    <w:link w:val="TextonotaalfinalCar"/>
     <w:uiPriority w:val="99"/>
     <w:semiHidden/>
     <w:unhideWhenUsed/>
   </w:style>
-  <w:style w:type="character" w:customStyle="1" w:styleId="EndnoteTextChar">
-    <w:name w:val="Endnote Text Char"/>
-    <w:link w:val="EndnoteText"/>
+  <w:style w:type="character" w:customStyle="1" w:styleId="TextonotaalfinalCar">
+    <w:name w:val="Texto nota al final Car"/>
+    <w:link w:val="Textonotaalfinal"/>
     <w:uiPriority w:val="99"/>
     <w:semiHidden/>
     <w:unhideWhenUsed/>

</xml_diff>